<commit_message>
add README, fix gitignore, add script-07 and trend visualizations
- Create README with project background, data sources, structure, and key findings
- Fix .gitignore: correct Data/ path casing, ignore large csv/dta, ignore RStudio temp plots
- Remove large CSV files from git index (merokok agregat, rasio keterlengkapan, HHI PODES)
- Add script 07: tobacco prevalence data cleaning and visualizations for 2015-2024 coalition report
- Add 3 output PNGs: prevalence and smoker count trends by age, prevalence by island
- Add CI analysis script (06) with PSU/strata design, sample completeness updates

Co-Authored-By: Claude Sonnet 4.6 <noreply@anthropic.com>
</commit_message>
<xml_diff>
--- a/Output/ovr-logit-res.docx
+++ b/Output/ovr-logit-res.docx
@@ -45,7 +45,6 @@
           <w:trHeight w:val="360" w:hRule="auto"/>
           <w:tblHeader/>
         </w:trPr>
-        header 1
         <w:tc>
           <w:tcPr>
             <w:tcBorders>
@@ -65,6 +64,7 @@
           </w:tcPr>
           <w:p>
             <w:pPr>
+              <w:pStyle w:val="Normal"/>
               <w:jc w:val="left"/>
               <w:pBdr>
                 <w:bottom w:val="none" w:sz="0" w:space="0" w:color="000000"/>
@@ -119,6 +119,7 @@
           </w:tcPr>
           <w:p>
             <w:pPr>
+              <w:pStyle w:val="Normal"/>
               <w:jc w:val="center"/>
               <w:pBdr>
                 <w:bottom w:val="none" w:sz="0" w:space="0" w:color="000000"/>
@@ -173,6 +174,7 @@
           </w:tcPr>
           <w:p>
             <w:pPr>
+              <w:pStyle w:val="Normal"/>
               <w:jc w:val="center"/>
               <w:pBdr>
                 <w:bottom w:val="none" w:sz="0" w:space="0" w:color="000000"/>
@@ -213,7 +215,6 @@
         <w:trPr>
           <w:trHeight w:val="360" w:hRule="auto"/>
         </w:trPr>
-        body 1
         <w:tc>
           <w:tcPr>
             <w:tcBorders>
@@ -233,6 +234,7 @@
           </w:tcPr>
           <w:p>
             <w:pPr>
+              <w:pStyle w:val="Normal"/>
               <w:jc w:val="left"/>
               <w:pBdr>
                 <w:bottom w:val="none" w:sz="0" w:space="0" w:color="000000"/>
@@ -287,6 +289,7 @@
           </w:tcPr>
           <w:p>
             <w:pPr>
+              <w:pStyle w:val="Normal"/>
               <w:jc w:val="center"/>
               <w:pBdr>
                 <w:bottom w:val="none" w:sz="0" w:space="0" w:color="000000"/>
@@ -341,6 +344,7 @@
           </w:tcPr>
           <w:p>
             <w:pPr>
+              <w:pStyle w:val="Normal"/>
               <w:jc w:val="center"/>
               <w:pBdr>
                 <w:bottom w:val="none" w:sz="0" w:space="0" w:color="000000"/>
@@ -381,26 +385,26 @@
         <w:trPr>
           <w:trHeight w:val="360" w:hRule="auto"/>
         </w:trPr>
-        body 2
-        <w:tc>
-          <w:tcPr>
-            <w:tcBorders>
-              <w:bottom w:val="none" w:sz="0" w:space="0" w:color="000000"/>
-              <w:top w:val="none" w:sz="0" w:space="0" w:color="000000"/>
-              <w:left w:val="none" w:sz="0" w:space="0" w:color="000000"/>
-              <w:right w:val="none" w:sz="0" w:space="0" w:color="000000"/>
-            </w:tcBorders>
-            <w:shd w:val="clear" w:color="auto" w:fill="FFFFFF"/>
-            <w:tcMar>
-              <w:top w:w="0" w:type="dxa"/>
-              <w:bottom w:w="0" w:type="dxa"/>
-              <w:left w:w="0" w:type="dxa"/>
-              <w:right w:w="0" w:type="dxa"/>
-            </w:tcMar>
-            <w:vAlign w:val="center"/>
-          </w:tcPr>
-          <w:p>
-            <w:pPr>
+        <w:tc>
+          <w:tcPr>
+            <w:tcBorders>
+              <w:bottom w:val="none" w:sz="0" w:space="0" w:color="000000"/>
+              <w:top w:val="none" w:sz="0" w:space="0" w:color="000000"/>
+              <w:left w:val="none" w:sz="0" w:space="0" w:color="000000"/>
+              <w:right w:val="none" w:sz="0" w:space="0" w:color="000000"/>
+            </w:tcBorders>
+            <w:shd w:val="clear" w:color="auto" w:fill="FFFFFF"/>
+            <w:tcMar>
+              <w:top w:w="0" w:type="dxa"/>
+              <w:bottom w:w="0" w:type="dxa"/>
+              <w:left w:w="0" w:type="dxa"/>
+              <w:right w:w="0" w:type="dxa"/>
+            </w:tcMar>
+            <w:vAlign w:val="center"/>
+          </w:tcPr>
+          <w:p>
+            <w:pPr>
+              <w:pStyle w:val="Normal"/>
               <w:jc w:val="left"/>
               <w:pBdr>
                 <w:bottom w:val="none" w:sz="0" w:space="0" w:color="000000"/>
@@ -455,6 +459,7 @@
           </w:tcPr>
           <w:p>
             <w:pPr>
+              <w:pStyle w:val="Normal"/>
               <w:jc w:val="center"/>
               <w:pBdr>
                 <w:bottom w:val="none" w:sz="0" w:space="0" w:color="000000"/>
@@ -509,6 +514,7 @@
           </w:tcPr>
           <w:p>
             <w:pPr>
+              <w:pStyle w:val="Normal"/>
               <w:jc w:val="center"/>
               <w:pBdr>
                 <w:bottom w:val="none" w:sz="0" w:space="0" w:color="000000"/>
@@ -549,26 +555,26 @@
         <w:trPr>
           <w:trHeight w:val="360" w:hRule="auto"/>
         </w:trPr>
-        body 3
-        <w:tc>
-          <w:tcPr>
-            <w:tcBorders>
-              <w:bottom w:val="none" w:sz="0" w:space="0" w:color="000000"/>
-              <w:top w:val="none" w:sz="0" w:space="0" w:color="000000"/>
-              <w:left w:val="none" w:sz="0" w:space="0" w:color="000000"/>
-              <w:right w:val="none" w:sz="0" w:space="0" w:color="000000"/>
-            </w:tcBorders>
-            <w:shd w:val="clear" w:color="auto" w:fill="FFFFFF"/>
-            <w:tcMar>
-              <w:top w:w="0" w:type="dxa"/>
-              <w:bottom w:w="0" w:type="dxa"/>
-              <w:left w:w="0" w:type="dxa"/>
-              <w:right w:w="0" w:type="dxa"/>
-            </w:tcMar>
-            <w:vAlign w:val="center"/>
-          </w:tcPr>
-          <w:p>
-            <w:pPr>
+        <w:tc>
+          <w:tcPr>
+            <w:tcBorders>
+              <w:bottom w:val="none" w:sz="0" w:space="0" w:color="000000"/>
+              <w:top w:val="none" w:sz="0" w:space="0" w:color="000000"/>
+              <w:left w:val="none" w:sz="0" w:space="0" w:color="000000"/>
+              <w:right w:val="none" w:sz="0" w:space="0" w:color="000000"/>
+            </w:tcBorders>
+            <w:shd w:val="clear" w:color="auto" w:fill="FFFFFF"/>
+            <w:tcMar>
+              <w:top w:w="0" w:type="dxa"/>
+              <w:bottom w:w="0" w:type="dxa"/>
+              <w:left w:w="0" w:type="dxa"/>
+              <w:right w:w="0" w:type="dxa"/>
+            </w:tcMar>
+            <w:vAlign w:val="center"/>
+          </w:tcPr>
+          <w:p>
+            <w:pPr>
+              <w:pStyle w:val="Normal"/>
               <w:jc w:val="left"/>
               <w:pBdr>
                 <w:bottom w:val="none" w:sz="0" w:space="0" w:color="000000"/>
@@ -623,6 +629,7 @@
           </w:tcPr>
           <w:p>
             <w:pPr>
+              <w:pStyle w:val="Normal"/>
               <w:jc w:val="center"/>
               <w:pBdr>
                 <w:bottom w:val="none" w:sz="0" w:space="0" w:color="000000"/>
@@ -677,6 +684,7 @@
           </w:tcPr>
           <w:p>
             <w:pPr>
+              <w:pStyle w:val="Normal"/>
               <w:jc w:val="center"/>
               <w:pBdr>
                 <w:bottom w:val="none" w:sz="0" w:space="0" w:color="000000"/>
@@ -717,26 +725,26 @@
         <w:trPr>
           <w:trHeight w:val="360" w:hRule="auto"/>
         </w:trPr>
-        body 4
-        <w:tc>
-          <w:tcPr>
-            <w:tcBorders>
-              <w:bottom w:val="none" w:sz="0" w:space="0" w:color="000000"/>
-              <w:top w:val="none" w:sz="0" w:space="0" w:color="000000"/>
-              <w:left w:val="none" w:sz="0" w:space="0" w:color="000000"/>
-              <w:right w:val="none" w:sz="0" w:space="0" w:color="000000"/>
-            </w:tcBorders>
-            <w:shd w:val="clear" w:color="auto" w:fill="FFFFFF"/>
-            <w:tcMar>
-              <w:top w:w="0" w:type="dxa"/>
-              <w:bottom w:w="0" w:type="dxa"/>
-              <w:left w:w="0" w:type="dxa"/>
-              <w:right w:w="0" w:type="dxa"/>
-            </w:tcMar>
-            <w:vAlign w:val="center"/>
-          </w:tcPr>
-          <w:p>
-            <w:pPr>
+        <w:tc>
+          <w:tcPr>
+            <w:tcBorders>
+              <w:bottom w:val="none" w:sz="0" w:space="0" w:color="000000"/>
+              <w:top w:val="none" w:sz="0" w:space="0" w:color="000000"/>
+              <w:left w:val="none" w:sz="0" w:space="0" w:color="000000"/>
+              <w:right w:val="none" w:sz="0" w:space="0" w:color="000000"/>
+            </w:tcBorders>
+            <w:shd w:val="clear" w:color="auto" w:fill="FFFFFF"/>
+            <w:tcMar>
+              <w:top w:w="0" w:type="dxa"/>
+              <w:bottom w:w="0" w:type="dxa"/>
+              <w:left w:w="0" w:type="dxa"/>
+              <w:right w:w="0" w:type="dxa"/>
+            </w:tcMar>
+            <w:vAlign w:val="center"/>
+          </w:tcPr>
+          <w:p>
+            <w:pPr>
+              <w:pStyle w:val="Normal"/>
               <w:jc w:val="left"/>
               <w:pBdr>
                 <w:bottom w:val="none" w:sz="0" w:space="0" w:color="000000"/>
@@ -791,6 +799,7 @@
           </w:tcPr>
           <w:p>
             <w:pPr>
+              <w:pStyle w:val="Normal"/>
               <w:jc w:val="center"/>
               <w:pBdr>
                 <w:bottom w:val="none" w:sz="0" w:space="0" w:color="000000"/>
@@ -845,6 +854,7 @@
           </w:tcPr>
           <w:p>
             <w:pPr>
+              <w:pStyle w:val="Normal"/>
               <w:jc w:val="center"/>
               <w:pBdr>
                 <w:bottom w:val="none" w:sz="0" w:space="0" w:color="000000"/>
@@ -885,26 +895,26 @@
         <w:trPr>
           <w:trHeight w:val="360" w:hRule="auto"/>
         </w:trPr>
-        body 5
-        <w:tc>
-          <w:tcPr>
-            <w:tcBorders>
-              <w:bottom w:val="none" w:sz="0" w:space="0" w:color="000000"/>
-              <w:top w:val="none" w:sz="0" w:space="0" w:color="000000"/>
-              <w:left w:val="none" w:sz="0" w:space="0" w:color="000000"/>
-              <w:right w:val="none" w:sz="0" w:space="0" w:color="000000"/>
-            </w:tcBorders>
-            <w:shd w:val="clear" w:color="auto" w:fill="FFFFFF"/>
-            <w:tcMar>
-              <w:top w:w="0" w:type="dxa"/>
-              <w:bottom w:w="0" w:type="dxa"/>
-              <w:left w:w="0" w:type="dxa"/>
-              <w:right w:w="0" w:type="dxa"/>
-            </w:tcMar>
-            <w:vAlign w:val="center"/>
-          </w:tcPr>
-          <w:p>
-            <w:pPr>
+        <w:tc>
+          <w:tcPr>
+            <w:tcBorders>
+              <w:bottom w:val="none" w:sz="0" w:space="0" w:color="000000"/>
+              <w:top w:val="none" w:sz="0" w:space="0" w:color="000000"/>
+              <w:left w:val="none" w:sz="0" w:space="0" w:color="000000"/>
+              <w:right w:val="none" w:sz="0" w:space="0" w:color="000000"/>
+            </w:tcBorders>
+            <w:shd w:val="clear" w:color="auto" w:fill="FFFFFF"/>
+            <w:tcMar>
+              <w:top w:w="0" w:type="dxa"/>
+              <w:bottom w:w="0" w:type="dxa"/>
+              <w:left w:w="0" w:type="dxa"/>
+              <w:right w:w="0" w:type="dxa"/>
+            </w:tcMar>
+            <w:vAlign w:val="center"/>
+          </w:tcPr>
+          <w:p>
+            <w:pPr>
+              <w:pStyle w:val="Normal"/>
               <w:jc w:val="left"/>
               <w:pBdr>
                 <w:bottom w:val="none" w:sz="0" w:space="0" w:color="000000"/>
@@ -959,6 +969,7 @@
           </w:tcPr>
           <w:p>
             <w:pPr>
+              <w:pStyle w:val="Normal"/>
               <w:jc w:val="center"/>
               <w:pBdr>
                 <w:bottom w:val="none" w:sz="0" w:space="0" w:color="000000"/>
@@ -1013,6 +1024,7 @@
           </w:tcPr>
           <w:p>
             <w:pPr>
+              <w:pStyle w:val="Normal"/>
               <w:jc w:val="center"/>
               <w:pBdr>
                 <w:bottom w:val="none" w:sz="0" w:space="0" w:color="000000"/>
@@ -1053,26 +1065,26 @@
         <w:trPr>
           <w:trHeight w:val="360" w:hRule="auto"/>
         </w:trPr>
-        body 6
-        <w:tc>
-          <w:tcPr>
-            <w:tcBorders>
-              <w:bottom w:val="none" w:sz="0" w:space="0" w:color="000000"/>
-              <w:top w:val="none" w:sz="0" w:space="0" w:color="000000"/>
-              <w:left w:val="none" w:sz="0" w:space="0" w:color="000000"/>
-              <w:right w:val="none" w:sz="0" w:space="0" w:color="000000"/>
-            </w:tcBorders>
-            <w:shd w:val="clear" w:color="auto" w:fill="FFFFFF"/>
-            <w:tcMar>
-              <w:top w:w="0" w:type="dxa"/>
-              <w:bottom w:w="0" w:type="dxa"/>
-              <w:left w:w="0" w:type="dxa"/>
-              <w:right w:w="0" w:type="dxa"/>
-            </w:tcMar>
-            <w:vAlign w:val="center"/>
-          </w:tcPr>
-          <w:p>
-            <w:pPr>
+        <w:tc>
+          <w:tcPr>
+            <w:tcBorders>
+              <w:bottom w:val="none" w:sz="0" w:space="0" w:color="000000"/>
+              <w:top w:val="none" w:sz="0" w:space="0" w:color="000000"/>
+              <w:left w:val="none" w:sz="0" w:space="0" w:color="000000"/>
+              <w:right w:val="none" w:sz="0" w:space="0" w:color="000000"/>
+            </w:tcBorders>
+            <w:shd w:val="clear" w:color="auto" w:fill="FFFFFF"/>
+            <w:tcMar>
+              <w:top w:w="0" w:type="dxa"/>
+              <w:bottom w:w="0" w:type="dxa"/>
+              <w:left w:w="0" w:type="dxa"/>
+              <w:right w:w="0" w:type="dxa"/>
+            </w:tcMar>
+            <w:vAlign w:val="center"/>
+          </w:tcPr>
+          <w:p>
+            <w:pPr>
+              <w:pStyle w:val="Normal"/>
               <w:jc w:val="left"/>
               <w:pBdr>
                 <w:bottom w:val="none" w:sz="0" w:space="0" w:color="000000"/>
@@ -1127,6 +1139,7 @@
           </w:tcPr>
           <w:p>
             <w:pPr>
+              <w:pStyle w:val="Normal"/>
               <w:jc w:val="center"/>
               <w:pBdr>
                 <w:bottom w:val="none" w:sz="0" w:space="0" w:color="000000"/>
@@ -1181,6 +1194,7 @@
           </w:tcPr>
           <w:p>
             <w:pPr>
+              <w:pStyle w:val="Normal"/>
               <w:jc w:val="center"/>
               <w:pBdr>
                 <w:bottom w:val="none" w:sz="0" w:space="0" w:color="000000"/>
@@ -1221,26 +1235,26 @@
         <w:trPr>
           <w:trHeight w:val="360" w:hRule="auto"/>
         </w:trPr>
-        body 7
-        <w:tc>
-          <w:tcPr>
-            <w:tcBorders>
-              <w:bottom w:val="none" w:sz="0" w:space="0" w:color="000000"/>
-              <w:top w:val="none" w:sz="0" w:space="0" w:color="000000"/>
-              <w:left w:val="none" w:sz="0" w:space="0" w:color="000000"/>
-              <w:right w:val="none" w:sz="0" w:space="0" w:color="000000"/>
-            </w:tcBorders>
-            <w:shd w:val="clear" w:color="auto" w:fill="FFFFFF"/>
-            <w:tcMar>
-              <w:top w:w="0" w:type="dxa"/>
-              <w:bottom w:w="0" w:type="dxa"/>
-              <w:left w:w="0" w:type="dxa"/>
-              <w:right w:w="0" w:type="dxa"/>
-            </w:tcMar>
-            <w:vAlign w:val="center"/>
-          </w:tcPr>
-          <w:p>
-            <w:pPr>
+        <w:tc>
+          <w:tcPr>
+            <w:tcBorders>
+              <w:bottom w:val="none" w:sz="0" w:space="0" w:color="000000"/>
+              <w:top w:val="none" w:sz="0" w:space="0" w:color="000000"/>
+              <w:left w:val="none" w:sz="0" w:space="0" w:color="000000"/>
+              <w:right w:val="none" w:sz="0" w:space="0" w:color="000000"/>
+            </w:tcBorders>
+            <w:shd w:val="clear" w:color="auto" w:fill="FFFFFF"/>
+            <w:tcMar>
+              <w:top w:w="0" w:type="dxa"/>
+              <w:bottom w:w="0" w:type="dxa"/>
+              <w:left w:w="0" w:type="dxa"/>
+              <w:right w:w="0" w:type="dxa"/>
+            </w:tcMar>
+            <w:vAlign w:val="center"/>
+          </w:tcPr>
+          <w:p>
+            <w:pPr>
+              <w:pStyle w:val="Normal"/>
               <w:jc w:val="left"/>
               <w:pBdr>
                 <w:bottom w:val="none" w:sz="0" w:space="0" w:color="000000"/>
@@ -1295,6 +1309,7 @@
           </w:tcPr>
           <w:p>
             <w:pPr>
+              <w:pStyle w:val="Normal"/>
               <w:jc w:val="center"/>
               <w:pBdr>
                 <w:bottom w:val="none" w:sz="0" w:space="0" w:color="000000"/>
@@ -1349,6 +1364,7 @@
           </w:tcPr>
           <w:p>
             <w:pPr>
+              <w:pStyle w:val="Normal"/>
               <w:jc w:val="center"/>
               <w:pBdr>
                 <w:bottom w:val="none" w:sz="0" w:space="0" w:color="000000"/>
@@ -1389,26 +1405,26 @@
         <w:trPr>
           <w:trHeight w:val="360" w:hRule="auto"/>
         </w:trPr>
-        body 8
-        <w:tc>
-          <w:tcPr>
-            <w:tcBorders>
-              <w:bottom w:val="none" w:sz="0" w:space="0" w:color="000000"/>
-              <w:top w:val="none" w:sz="0" w:space="0" w:color="000000"/>
-              <w:left w:val="none" w:sz="0" w:space="0" w:color="000000"/>
-              <w:right w:val="none" w:sz="0" w:space="0" w:color="000000"/>
-            </w:tcBorders>
-            <w:shd w:val="clear" w:color="auto" w:fill="FFFFFF"/>
-            <w:tcMar>
-              <w:top w:w="0" w:type="dxa"/>
-              <w:bottom w:w="0" w:type="dxa"/>
-              <w:left w:w="0" w:type="dxa"/>
-              <w:right w:w="0" w:type="dxa"/>
-            </w:tcMar>
-            <w:vAlign w:val="center"/>
-          </w:tcPr>
-          <w:p>
-            <w:pPr>
+        <w:tc>
+          <w:tcPr>
+            <w:tcBorders>
+              <w:bottom w:val="none" w:sz="0" w:space="0" w:color="000000"/>
+              <w:top w:val="none" w:sz="0" w:space="0" w:color="000000"/>
+              <w:left w:val="none" w:sz="0" w:space="0" w:color="000000"/>
+              <w:right w:val="none" w:sz="0" w:space="0" w:color="000000"/>
+            </w:tcBorders>
+            <w:shd w:val="clear" w:color="auto" w:fill="FFFFFF"/>
+            <w:tcMar>
+              <w:top w:w="0" w:type="dxa"/>
+              <w:bottom w:w="0" w:type="dxa"/>
+              <w:left w:w="0" w:type="dxa"/>
+              <w:right w:w="0" w:type="dxa"/>
+            </w:tcMar>
+            <w:vAlign w:val="center"/>
+          </w:tcPr>
+          <w:p>
+            <w:pPr>
+              <w:pStyle w:val="Normal"/>
               <w:jc w:val="left"/>
               <w:pBdr>
                 <w:bottom w:val="none" w:sz="0" w:space="0" w:color="000000"/>
@@ -1463,6 +1479,7 @@
           </w:tcPr>
           <w:p>
             <w:pPr>
+              <w:pStyle w:val="Normal"/>
               <w:jc w:val="center"/>
               <w:pBdr>
                 <w:bottom w:val="none" w:sz="0" w:space="0" w:color="000000"/>
@@ -1517,6 +1534,7 @@
           </w:tcPr>
           <w:p>
             <w:pPr>
+              <w:pStyle w:val="Normal"/>
               <w:jc w:val="center"/>
               <w:pBdr>
                 <w:bottom w:val="none" w:sz="0" w:space="0" w:color="000000"/>
@@ -1557,26 +1575,26 @@
         <w:trPr>
           <w:trHeight w:val="360" w:hRule="auto"/>
         </w:trPr>
-        body 9
-        <w:tc>
-          <w:tcPr>
-            <w:tcBorders>
-              <w:bottom w:val="none" w:sz="0" w:space="0" w:color="000000"/>
-              <w:top w:val="none" w:sz="0" w:space="0" w:color="000000"/>
-              <w:left w:val="none" w:sz="0" w:space="0" w:color="000000"/>
-              <w:right w:val="none" w:sz="0" w:space="0" w:color="000000"/>
-            </w:tcBorders>
-            <w:shd w:val="clear" w:color="auto" w:fill="FFFFFF"/>
-            <w:tcMar>
-              <w:top w:w="0" w:type="dxa"/>
-              <w:bottom w:w="0" w:type="dxa"/>
-              <w:left w:w="0" w:type="dxa"/>
-              <w:right w:w="0" w:type="dxa"/>
-            </w:tcMar>
-            <w:vAlign w:val="center"/>
-          </w:tcPr>
-          <w:p>
-            <w:pPr>
+        <w:tc>
+          <w:tcPr>
+            <w:tcBorders>
+              <w:bottom w:val="none" w:sz="0" w:space="0" w:color="000000"/>
+              <w:top w:val="none" w:sz="0" w:space="0" w:color="000000"/>
+              <w:left w:val="none" w:sz="0" w:space="0" w:color="000000"/>
+              <w:right w:val="none" w:sz="0" w:space="0" w:color="000000"/>
+            </w:tcBorders>
+            <w:shd w:val="clear" w:color="auto" w:fill="FFFFFF"/>
+            <w:tcMar>
+              <w:top w:w="0" w:type="dxa"/>
+              <w:bottom w:w="0" w:type="dxa"/>
+              <w:left w:w="0" w:type="dxa"/>
+              <w:right w:w="0" w:type="dxa"/>
+            </w:tcMar>
+            <w:vAlign w:val="center"/>
+          </w:tcPr>
+          <w:p>
+            <w:pPr>
+              <w:pStyle w:val="Normal"/>
               <w:jc w:val="left"/>
               <w:pBdr>
                 <w:bottom w:val="none" w:sz="0" w:space="0" w:color="000000"/>
@@ -1631,6 +1649,7 @@
           </w:tcPr>
           <w:p>
             <w:pPr>
+              <w:pStyle w:val="Normal"/>
               <w:jc w:val="center"/>
               <w:pBdr>
                 <w:bottom w:val="none" w:sz="0" w:space="0" w:color="000000"/>
@@ -1685,6 +1704,7 @@
           </w:tcPr>
           <w:p>
             <w:pPr>
+              <w:pStyle w:val="Normal"/>
               <w:jc w:val="center"/>
               <w:pBdr>
                 <w:bottom w:val="none" w:sz="0" w:space="0" w:color="000000"/>
@@ -1725,7 +1745,6 @@
         <w:trPr>
           <w:trHeight w:val="360" w:hRule="auto"/>
         </w:trPr>
-        body10
         <w:tc>
           <w:tcPr>
             <w:tcBorders>
@@ -1745,6 +1764,7 @@
           </w:tcPr>
           <w:p>
             <w:pPr>
+              <w:pStyle w:val="Normal"/>
               <w:jc w:val="left"/>
               <w:pBdr>
                 <w:bottom w:val="none" w:sz="0" w:space="0" w:color="000000"/>
@@ -1799,6 +1819,7 @@
           </w:tcPr>
           <w:p>
             <w:pPr>
+              <w:pStyle w:val="Normal"/>
               <w:jc w:val="center"/>
               <w:pBdr>
                 <w:bottom w:val="none" w:sz="0" w:space="0" w:color="000000"/>
@@ -1853,6 +1874,7 @@
           </w:tcPr>
           <w:p>
             <w:pPr>
+              <w:pStyle w:val="Normal"/>
               <w:jc w:val="center"/>
               <w:pBdr>
                 <w:bottom w:val="none" w:sz="0" w:space="0" w:color="000000"/>
@@ -1893,7 +1915,6 @@
         <w:trPr>
           <w:trHeight w:val="360" w:hRule="auto"/>
         </w:trPr>
-        body11
         <w:tc>
           <w:tcPr>
             <w:tcBorders>
@@ -1913,6 +1934,7 @@
           </w:tcPr>
           <w:p>
             <w:pPr>
+              <w:pStyle w:val="Normal"/>
               <w:jc w:val="left"/>
               <w:pBdr>
                 <w:bottom w:val="none" w:sz="0" w:space="0" w:color="000000"/>
@@ -1967,6 +1989,7 @@
           </w:tcPr>
           <w:p>
             <w:pPr>
+              <w:pStyle w:val="Normal"/>
               <w:jc w:val="center"/>
               <w:pBdr>
                 <w:bottom w:val="none" w:sz="0" w:space="0" w:color="000000"/>
@@ -2021,6 +2044,7 @@
           </w:tcPr>
           <w:p>
             <w:pPr>
+              <w:pStyle w:val="Normal"/>
               <w:jc w:val="center"/>
               <w:pBdr>
                 <w:bottom w:val="none" w:sz="0" w:space="0" w:color="000000"/>
@@ -2061,26 +2085,26 @@
         <w:trPr>
           <w:trHeight w:val="360" w:hRule="auto"/>
         </w:trPr>
-        body12
-        <w:tc>
-          <w:tcPr>
-            <w:tcBorders>
-              <w:bottom w:val="none" w:sz="0" w:space="0" w:color="000000"/>
-              <w:top w:val="none" w:sz="0" w:space="0" w:color="000000"/>
-              <w:left w:val="none" w:sz="0" w:space="0" w:color="000000"/>
-              <w:right w:val="none" w:sz="0" w:space="0" w:color="000000"/>
-            </w:tcBorders>
-            <w:shd w:val="clear" w:color="auto" w:fill="FFFFFF"/>
-            <w:tcMar>
-              <w:top w:w="0" w:type="dxa"/>
-              <w:bottom w:w="0" w:type="dxa"/>
-              <w:left w:w="0" w:type="dxa"/>
-              <w:right w:w="0" w:type="dxa"/>
-            </w:tcMar>
-            <w:vAlign w:val="center"/>
-          </w:tcPr>
-          <w:p>
-            <w:pPr>
+        <w:tc>
+          <w:tcPr>
+            <w:tcBorders>
+              <w:bottom w:val="none" w:sz="0" w:space="0" w:color="000000"/>
+              <w:top w:val="none" w:sz="0" w:space="0" w:color="000000"/>
+              <w:left w:val="none" w:sz="0" w:space="0" w:color="000000"/>
+              <w:right w:val="none" w:sz="0" w:space="0" w:color="000000"/>
+            </w:tcBorders>
+            <w:shd w:val="clear" w:color="auto" w:fill="FFFFFF"/>
+            <w:tcMar>
+              <w:top w:w="0" w:type="dxa"/>
+              <w:bottom w:w="0" w:type="dxa"/>
+              <w:left w:w="0" w:type="dxa"/>
+              <w:right w:w="0" w:type="dxa"/>
+            </w:tcMar>
+            <w:vAlign w:val="center"/>
+          </w:tcPr>
+          <w:p>
+            <w:pPr>
+              <w:pStyle w:val="Normal"/>
               <w:jc w:val="left"/>
               <w:pBdr>
                 <w:bottom w:val="none" w:sz="0" w:space="0" w:color="000000"/>
@@ -2135,6 +2159,7 @@
           </w:tcPr>
           <w:p>
             <w:pPr>
+              <w:pStyle w:val="Normal"/>
               <w:jc w:val="center"/>
               <w:pBdr>
                 <w:bottom w:val="none" w:sz="0" w:space="0" w:color="000000"/>
@@ -2189,6 +2214,7 @@
           </w:tcPr>
           <w:p>
             <w:pPr>
+              <w:pStyle w:val="Normal"/>
               <w:jc w:val="center"/>
               <w:pBdr>
                 <w:bottom w:val="none" w:sz="0" w:space="0" w:color="000000"/>
@@ -2229,26 +2255,26 @@
         <w:trPr>
           <w:trHeight w:val="360" w:hRule="auto"/>
         </w:trPr>
-        body13
-        <w:tc>
-          <w:tcPr>
-            <w:tcBorders>
-              <w:bottom w:val="none" w:sz="0" w:space="0" w:color="000000"/>
-              <w:top w:val="none" w:sz="0" w:space="0" w:color="000000"/>
-              <w:left w:val="none" w:sz="0" w:space="0" w:color="000000"/>
-              <w:right w:val="none" w:sz="0" w:space="0" w:color="000000"/>
-            </w:tcBorders>
-            <w:shd w:val="clear" w:color="auto" w:fill="FFFFFF"/>
-            <w:tcMar>
-              <w:top w:w="0" w:type="dxa"/>
-              <w:bottom w:w="0" w:type="dxa"/>
-              <w:left w:w="0" w:type="dxa"/>
-              <w:right w:w="0" w:type="dxa"/>
-            </w:tcMar>
-            <w:vAlign w:val="center"/>
-          </w:tcPr>
-          <w:p>
-            <w:pPr>
+        <w:tc>
+          <w:tcPr>
+            <w:tcBorders>
+              <w:bottom w:val="none" w:sz="0" w:space="0" w:color="000000"/>
+              <w:top w:val="none" w:sz="0" w:space="0" w:color="000000"/>
+              <w:left w:val="none" w:sz="0" w:space="0" w:color="000000"/>
+              <w:right w:val="none" w:sz="0" w:space="0" w:color="000000"/>
+            </w:tcBorders>
+            <w:shd w:val="clear" w:color="auto" w:fill="FFFFFF"/>
+            <w:tcMar>
+              <w:top w:w="0" w:type="dxa"/>
+              <w:bottom w:w="0" w:type="dxa"/>
+              <w:left w:w="0" w:type="dxa"/>
+              <w:right w:w="0" w:type="dxa"/>
+            </w:tcMar>
+            <w:vAlign w:val="center"/>
+          </w:tcPr>
+          <w:p>
+            <w:pPr>
+              <w:pStyle w:val="Normal"/>
               <w:jc w:val="left"/>
               <w:pBdr>
                 <w:bottom w:val="none" w:sz="0" w:space="0" w:color="000000"/>
@@ -2303,6 +2329,7 @@
           </w:tcPr>
           <w:p>
             <w:pPr>
+              <w:pStyle w:val="Normal"/>
               <w:jc w:val="center"/>
               <w:pBdr>
                 <w:bottom w:val="none" w:sz="0" w:space="0" w:color="000000"/>
@@ -2357,6 +2384,7 @@
           </w:tcPr>
           <w:p>
             <w:pPr>
+              <w:pStyle w:val="Normal"/>
               <w:jc w:val="center"/>
               <w:pBdr>
                 <w:bottom w:val="none" w:sz="0" w:space="0" w:color="000000"/>
@@ -2397,26 +2425,26 @@
         <w:trPr>
           <w:trHeight w:val="360" w:hRule="auto"/>
         </w:trPr>
-        body14
-        <w:tc>
-          <w:tcPr>
-            <w:tcBorders>
-              <w:bottom w:val="none" w:sz="0" w:space="0" w:color="000000"/>
-              <w:top w:val="none" w:sz="0" w:space="0" w:color="000000"/>
-              <w:left w:val="none" w:sz="0" w:space="0" w:color="000000"/>
-              <w:right w:val="none" w:sz="0" w:space="0" w:color="000000"/>
-            </w:tcBorders>
-            <w:shd w:val="clear" w:color="auto" w:fill="FFFFFF"/>
-            <w:tcMar>
-              <w:top w:w="0" w:type="dxa"/>
-              <w:bottom w:w="0" w:type="dxa"/>
-              <w:left w:w="0" w:type="dxa"/>
-              <w:right w:w="0" w:type="dxa"/>
-            </w:tcMar>
-            <w:vAlign w:val="center"/>
-          </w:tcPr>
-          <w:p>
-            <w:pPr>
+        <w:tc>
+          <w:tcPr>
+            <w:tcBorders>
+              <w:bottom w:val="none" w:sz="0" w:space="0" w:color="000000"/>
+              <w:top w:val="none" w:sz="0" w:space="0" w:color="000000"/>
+              <w:left w:val="none" w:sz="0" w:space="0" w:color="000000"/>
+              <w:right w:val="none" w:sz="0" w:space="0" w:color="000000"/>
+            </w:tcBorders>
+            <w:shd w:val="clear" w:color="auto" w:fill="FFFFFF"/>
+            <w:tcMar>
+              <w:top w:w="0" w:type="dxa"/>
+              <w:bottom w:w="0" w:type="dxa"/>
+              <w:left w:w="0" w:type="dxa"/>
+              <w:right w:w="0" w:type="dxa"/>
+            </w:tcMar>
+            <w:vAlign w:val="center"/>
+          </w:tcPr>
+          <w:p>
+            <w:pPr>
+              <w:pStyle w:val="Normal"/>
               <w:jc w:val="left"/>
               <w:pBdr>
                 <w:bottom w:val="none" w:sz="0" w:space="0" w:color="000000"/>
@@ -2471,6 +2499,7 @@
           </w:tcPr>
           <w:p>
             <w:pPr>
+              <w:pStyle w:val="Normal"/>
               <w:jc w:val="center"/>
               <w:pBdr>
                 <w:bottom w:val="none" w:sz="0" w:space="0" w:color="000000"/>
@@ -2525,6 +2554,7 @@
           </w:tcPr>
           <w:p>
             <w:pPr>
+              <w:pStyle w:val="Normal"/>
               <w:jc w:val="center"/>
               <w:pBdr>
                 <w:bottom w:val="none" w:sz="0" w:space="0" w:color="000000"/>
@@ -2565,26 +2595,26 @@
         <w:trPr>
           <w:trHeight w:val="360" w:hRule="auto"/>
         </w:trPr>
-        body15
-        <w:tc>
-          <w:tcPr>
-            <w:tcBorders>
-              <w:bottom w:val="none" w:sz="0" w:space="0" w:color="000000"/>
-              <w:top w:val="none" w:sz="0" w:space="0" w:color="000000"/>
-              <w:left w:val="none" w:sz="0" w:space="0" w:color="000000"/>
-              <w:right w:val="none" w:sz="0" w:space="0" w:color="000000"/>
-            </w:tcBorders>
-            <w:shd w:val="clear" w:color="auto" w:fill="FFFFFF"/>
-            <w:tcMar>
-              <w:top w:w="0" w:type="dxa"/>
-              <w:bottom w:w="0" w:type="dxa"/>
-              <w:left w:w="0" w:type="dxa"/>
-              <w:right w:w="0" w:type="dxa"/>
-            </w:tcMar>
-            <w:vAlign w:val="center"/>
-          </w:tcPr>
-          <w:p>
-            <w:pPr>
+        <w:tc>
+          <w:tcPr>
+            <w:tcBorders>
+              <w:bottom w:val="none" w:sz="0" w:space="0" w:color="000000"/>
+              <w:top w:val="none" w:sz="0" w:space="0" w:color="000000"/>
+              <w:left w:val="none" w:sz="0" w:space="0" w:color="000000"/>
+              <w:right w:val="none" w:sz="0" w:space="0" w:color="000000"/>
+            </w:tcBorders>
+            <w:shd w:val="clear" w:color="auto" w:fill="FFFFFF"/>
+            <w:tcMar>
+              <w:top w:w="0" w:type="dxa"/>
+              <w:bottom w:w="0" w:type="dxa"/>
+              <w:left w:w="0" w:type="dxa"/>
+              <w:right w:w="0" w:type="dxa"/>
+            </w:tcMar>
+            <w:vAlign w:val="center"/>
+          </w:tcPr>
+          <w:p>
+            <w:pPr>
+              <w:pStyle w:val="Normal"/>
               <w:jc w:val="left"/>
               <w:pBdr>
                 <w:bottom w:val="none" w:sz="0" w:space="0" w:color="000000"/>
@@ -2639,6 +2669,7 @@
           </w:tcPr>
           <w:p>
             <w:pPr>
+              <w:pStyle w:val="Normal"/>
               <w:jc w:val="center"/>
               <w:pBdr>
                 <w:bottom w:val="none" w:sz="0" w:space="0" w:color="000000"/>
@@ -2693,6 +2724,7 @@
           </w:tcPr>
           <w:p>
             <w:pPr>
+              <w:pStyle w:val="Normal"/>
               <w:jc w:val="center"/>
               <w:pBdr>
                 <w:bottom w:val="none" w:sz="0" w:space="0" w:color="000000"/>
@@ -2733,26 +2765,26 @@
         <w:trPr>
           <w:trHeight w:val="360" w:hRule="auto"/>
         </w:trPr>
-        body16
-        <w:tc>
-          <w:tcPr>
-            <w:tcBorders>
-              <w:bottom w:val="none" w:sz="0" w:space="0" w:color="000000"/>
-              <w:top w:val="none" w:sz="0" w:space="0" w:color="000000"/>
-              <w:left w:val="none" w:sz="0" w:space="0" w:color="000000"/>
-              <w:right w:val="none" w:sz="0" w:space="0" w:color="000000"/>
-            </w:tcBorders>
-            <w:shd w:val="clear" w:color="auto" w:fill="FFFFFF"/>
-            <w:tcMar>
-              <w:top w:w="0" w:type="dxa"/>
-              <w:bottom w:w="0" w:type="dxa"/>
-              <w:left w:w="0" w:type="dxa"/>
-              <w:right w:w="0" w:type="dxa"/>
-            </w:tcMar>
-            <w:vAlign w:val="center"/>
-          </w:tcPr>
-          <w:p>
-            <w:pPr>
+        <w:tc>
+          <w:tcPr>
+            <w:tcBorders>
+              <w:bottom w:val="none" w:sz="0" w:space="0" w:color="000000"/>
+              <w:top w:val="none" w:sz="0" w:space="0" w:color="000000"/>
+              <w:left w:val="none" w:sz="0" w:space="0" w:color="000000"/>
+              <w:right w:val="none" w:sz="0" w:space="0" w:color="000000"/>
+            </w:tcBorders>
+            <w:shd w:val="clear" w:color="auto" w:fill="FFFFFF"/>
+            <w:tcMar>
+              <w:top w:w="0" w:type="dxa"/>
+              <w:bottom w:w="0" w:type="dxa"/>
+              <w:left w:w="0" w:type="dxa"/>
+              <w:right w:w="0" w:type="dxa"/>
+            </w:tcMar>
+            <w:vAlign w:val="center"/>
+          </w:tcPr>
+          <w:p>
+            <w:pPr>
+              <w:pStyle w:val="Normal"/>
               <w:jc w:val="left"/>
               <w:pBdr>
                 <w:bottom w:val="none" w:sz="0" w:space="0" w:color="000000"/>
@@ -2807,6 +2839,7 @@
           </w:tcPr>
           <w:p>
             <w:pPr>
+              <w:pStyle w:val="Normal"/>
               <w:jc w:val="center"/>
               <w:pBdr>
                 <w:bottom w:val="none" w:sz="0" w:space="0" w:color="000000"/>
@@ -2861,6 +2894,7 @@
           </w:tcPr>
           <w:p>
             <w:pPr>
+              <w:pStyle w:val="Normal"/>
               <w:jc w:val="center"/>
               <w:pBdr>
                 <w:bottom w:val="none" w:sz="0" w:space="0" w:color="000000"/>
@@ -2901,7 +2935,6 @@
         <w:trPr>
           <w:trHeight w:val="360" w:hRule="auto"/>
         </w:trPr>
-        body17
         <w:tc>
           <w:tcPr>
             <w:tcBorders>
@@ -2921,6 +2954,7 @@
           </w:tcPr>
           <w:p>
             <w:pPr>
+              <w:pStyle w:val="Normal"/>
               <w:jc w:val="left"/>
               <w:pBdr>
                 <w:bottom w:val="none" w:sz="0" w:space="0" w:color="000000"/>
@@ -2975,6 +3009,7 @@
           </w:tcPr>
           <w:p>
             <w:pPr>
+              <w:pStyle w:val="Normal"/>
               <w:jc w:val="center"/>
               <w:pBdr>
                 <w:bottom w:val="none" w:sz="0" w:space="0" w:color="000000"/>
@@ -3029,6 +3064,7 @@
           </w:tcPr>
           <w:p>
             <w:pPr>
+              <w:pStyle w:val="Normal"/>
               <w:jc w:val="center"/>
               <w:pBdr>
                 <w:bottom w:val="none" w:sz="0" w:space="0" w:color="000000"/>
@@ -3069,7 +3105,6 @@
         <w:trPr>
           <w:trHeight w:val="360" w:hRule="auto"/>
         </w:trPr>
-        footer 1
         <w:tc>
           <w:tcPr>
             <w:gridSpan w:val="3"/>
@@ -3090,6 +3125,7 @@
           </w:tcPr>
           <w:p>
             <w:pPr>
+              <w:pStyle w:val="Normal"/>
               <w:jc w:val="left"/>
               <w:pBdr>
                 <w:bottom w:val="none" w:sz="0" w:space="0" w:color="000000"/>
@@ -3170,7 +3206,6 @@
           <w:trHeight w:val="360" w:hRule="auto"/>
           <w:tblHeader/>
         </w:trPr>
-        header 1
         <w:tc>
           <w:tcPr>
             <w:tcBorders>
@@ -3190,6 +3225,7 @@
           </w:tcPr>
           <w:p>
             <w:pPr>
+              <w:pStyle w:val="Normal"/>
               <w:jc w:val="left"/>
               <w:pBdr>
                 <w:bottom w:val="none" w:sz="0" w:space="0" w:color="000000"/>
@@ -3244,6 +3280,7 @@
           </w:tcPr>
           <w:p>
             <w:pPr>
+              <w:pStyle w:val="Normal"/>
               <w:jc w:val="center"/>
               <w:pBdr>
                 <w:bottom w:val="none" w:sz="0" w:space="0" w:color="000000"/>
@@ -3298,6 +3335,7 @@
           </w:tcPr>
           <w:p>
             <w:pPr>
+              <w:pStyle w:val="Normal"/>
               <w:jc w:val="center"/>
               <w:pBdr>
                 <w:bottom w:val="none" w:sz="0" w:space="0" w:color="000000"/>
@@ -3338,7 +3376,6 @@
         <w:trPr>
           <w:trHeight w:val="360" w:hRule="auto"/>
         </w:trPr>
-        body 1
         <w:tc>
           <w:tcPr>
             <w:tcBorders>
@@ -3358,6 +3395,7 @@
           </w:tcPr>
           <w:p>
             <w:pPr>
+              <w:pStyle w:val="Normal"/>
               <w:jc w:val="left"/>
               <w:pBdr>
                 <w:bottom w:val="none" w:sz="0" w:space="0" w:color="000000"/>
@@ -3412,6 +3450,7 @@
           </w:tcPr>
           <w:p>
             <w:pPr>
+              <w:pStyle w:val="Normal"/>
               <w:jc w:val="center"/>
               <w:pBdr>
                 <w:bottom w:val="none" w:sz="0" w:space="0" w:color="000000"/>
@@ -3466,6 +3505,7 @@
           </w:tcPr>
           <w:p>
             <w:pPr>
+              <w:pStyle w:val="Normal"/>
               <w:jc w:val="center"/>
               <w:pBdr>
                 <w:bottom w:val="none" w:sz="0" w:space="0" w:color="000000"/>
@@ -3506,26 +3546,26 @@
         <w:trPr>
           <w:trHeight w:val="360" w:hRule="auto"/>
         </w:trPr>
-        body 2
-        <w:tc>
-          <w:tcPr>
-            <w:tcBorders>
-              <w:bottom w:val="none" w:sz="0" w:space="0" w:color="000000"/>
-              <w:top w:val="none" w:sz="0" w:space="0" w:color="000000"/>
-              <w:left w:val="none" w:sz="0" w:space="0" w:color="000000"/>
-              <w:right w:val="none" w:sz="0" w:space="0" w:color="000000"/>
-            </w:tcBorders>
-            <w:shd w:val="clear" w:color="auto" w:fill="FFFFFF"/>
-            <w:tcMar>
-              <w:top w:w="0" w:type="dxa"/>
-              <w:bottom w:w="0" w:type="dxa"/>
-              <w:left w:w="0" w:type="dxa"/>
-              <w:right w:w="0" w:type="dxa"/>
-            </w:tcMar>
-            <w:vAlign w:val="center"/>
-          </w:tcPr>
-          <w:p>
-            <w:pPr>
+        <w:tc>
+          <w:tcPr>
+            <w:tcBorders>
+              <w:bottom w:val="none" w:sz="0" w:space="0" w:color="000000"/>
+              <w:top w:val="none" w:sz="0" w:space="0" w:color="000000"/>
+              <w:left w:val="none" w:sz="0" w:space="0" w:color="000000"/>
+              <w:right w:val="none" w:sz="0" w:space="0" w:color="000000"/>
+            </w:tcBorders>
+            <w:shd w:val="clear" w:color="auto" w:fill="FFFFFF"/>
+            <w:tcMar>
+              <w:top w:w="0" w:type="dxa"/>
+              <w:bottom w:w="0" w:type="dxa"/>
+              <w:left w:w="0" w:type="dxa"/>
+              <w:right w:w="0" w:type="dxa"/>
+            </w:tcMar>
+            <w:vAlign w:val="center"/>
+          </w:tcPr>
+          <w:p>
+            <w:pPr>
+              <w:pStyle w:val="Normal"/>
               <w:jc w:val="left"/>
               <w:pBdr>
                 <w:bottom w:val="none" w:sz="0" w:space="0" w:color="000000"/>
@@ -3580,6 +3620,7 @@
           </w:tcPr>
           <w:p>
             <w:pPr>
+              <w:pStyle w:val="Normal"/>
               <w:jc w:val="center"/>
               <w:pBdr>
                 <w:bottom w:val="none" w:sz="0" w:space="0" w:color="000000"/>
@@ -3634,6 +3675,7 @@
           </w:tcPr>
           <w:p>
             <w:pPr>
+              <w:pStyle w:val="Normal"/>
               <w:jc w:val="center"/>
               <w:pBdr>
                 <w:bottom w:val="none" w:sz="0" w:space="0" w:color="000000"/>
@@ -3674,26 +3716,26 @@
         <w:trPr>
           <w:trHeight w:val="360" w:hRule="auto"/>
         </w:trPr>
-        body 3
-        <w:tc>
-          <w:tcPr>
-            <w:tcBorders>
-              <w:bottom w:val="none" w:sz="0" w:space="0" w:color="000000"/>
-              <w:top w:val="none" w:sz="0" w:space="0" w:color="000000"/>
-              <w:left w:val="none" w:sz="0" w:space="0" w:color="000000"/>
-              <w:right w:val="none" w:sz="0" w:space="0" w:color="000000"/>
-            </w:tcBorders>
-            <w:shd w:val="clear" w:color="auto" w:fill="FFFFFF"/>
-            <w:tcMar>
-              <w:top w:w="0" w:type="dxa"/>
-              <w:bottom w:w="0" w:type="dxa"/>
-              <w:left w:w="0" w:type="dxa"/>
-              <w:right w:w="0" w:type="dxa"/>
-            </w:tcMar>
-            <w:vAlign w:val="center"/>
-          </w:tcPr>
-          <w:p>
-            <w:pPr>
+        <w:tc>
+          <w:tcPr>
+            <w:tcBorders>
+              <w:bottom w:val="none" w:sz="0" w:space="0" w:color="000000"/>
+              <w:top w:val="none" w:sz="0" w:space="0" w:color="000000"/>
+              <w:left w:val="none" w:sz="0" w:space="0" w:color="000000"/>
+              <w:right w:val="none" w:sz="0" w:space="0" w:color="000000"/>
+            </w:tcBorders>
+            <w:shd w:val="clear" w:color="auto" w:fill="FFFFFF"/>
+            <w:tcMar>
+              <w:top w:w="0" w:type="dxa"/>
+              <w:bottom w:w="0" w:type="dxa"/>
+              <w:left w:w="0" w:type="dxa"/>
+              <w:right w:w="0" w:type="dxa"/>
+            </w:tcMar>
+            <w:vAlign w:val="center"/>
+          </w:tcPr>
+          <w:p>
+            <w:pPr>
+              <w:pStyle w:val="Normal"/>
               <w:jc w:val="left"/>
               <w:pBdr>
                 <w:bottom w:val="none" w:sz="0" w:space="0" w:color="000000"/>
@@ -3748,6 +3790,7 @@
           </w:tcPr>
           <w:p>
             <w:pPr>
+              <w:pStyle w:val="Normal"/>
               <w:jc w:val="center"/>
               <w:pBdr>
                 <w:bottom w:val="none" w:sz="0" w:space="0" w:color="000000"/>
@@ -3802,6 +3845,7 @@
           </w:tcPr>
           <w:p>
             <w:pPr>
+              <w:pStyle w:val="Normal"/>
               <w:jc w:val="center"/>
               <w:pBdr>
                 <w:bottom w:val="none" w:sz="0" w:space="0" w:color="000000"/>
@@ -3842,26 +3886,26 @@
         <w:trPr>
           <w:trHeight w:val="360" w:hRule="auto"/>
         </w:trPr>
-        body 4
-        <w:tc>
-          <w:tcPr>
-            <w:tcBorders>
-              <w:bottom w:val="none" w:sz="0" w:space="0" w:color="000000"/>
-              <w:top w:val="none" w:sz="0" w:space="0" w:color="000000"/>
-              <w:left w:val="none" w:sz="0" w:space="0" w:color="000000"/>
-              <w:right w:val="none" w:sz="0" w:space="0" w:color="000000"/>
-            </w:tcBorders>
-            <w:shd w:val="clear" w:color="auto" w:fill="FFFFFF"/>
-            <w:tcMar>
-              <w:top w:w="0" w:type="dxa"/>
-              <w:bottom w:w="0" w:type="dxa"/>
-              <w:left w:w="0" w:type="dxa"/>
-              <w:right w:w="0" w:type="dxa"/>
-            </w:tcMar>
-            <w:vAlign w:val="center"/>
-          </w:tcPr>
-          <w:p>
-            <w:pPr>
+        <w:tc>
+          <w:tcPr>
+            <w:tcBorders>
+              <w:bottom w:val="none" w:sz="0" w:space="0" w:color="000000"/>
+              <w:top w:val="none" w:sz="0" w:space="0" w:color="000000"/>
+              <w:left w:val="none" w:sz="0" w:space="0" w:color="000000"/>
+              <w:right w:val="none" w:sz="0" w:space="0" w:color="000000"/>
+            </w:tcBorders>
+            <w:shd w:val="clear" w:color="auto" w:fill="FFFFFF"/>
+            <w:tcMar>
+              <w:top w:w="0" w:type="dxa"/>
+              <w:bottom w:w="0" w:type="dxa"/>
+              <w:left w:w="0" w:type="dxa"/>
+              <w:right w:w="0" w:type="dxa"/>
+            </w:tcMar>
+            <w:vAlign w:val="center"/>
+          </w:tcPr>
+          <w:p>
+            <w:pPr>
+              <w:pStyle w:val="Normal"/>
               <w:jc w:val="left"/>
               <w:pBdr>
                 <w:bottom w:val="none" w:sz="0" w:space="0" w:color="000000"/>
@@ -3916,6 +3960,7 @@
           </w:tcPr>
           <w:p>
             <w:pPr>
+              <w:pStyle w:val="Normal"/>
               <w:jc w:val="center"/>
               <w:pBdr>
                 <w:bottom w:val="none" w:sz="0" w:space="0" w:color="000000"/>
@@ -3970,6 +4015,7 @@
           </w:tcPr>
           <w:p>
             <w:pPr>
+              <w:pStyle w:val="Normal"/>
               <w:jc w:val="center"/>
               <w:pBdr>
                 <w:bottom w:val="none" w:sz="0" w:space="0" w:color="000000"/>
@@ -4010,26 +4056,26 @@
         <w:trPr>
           <w:trHeight w:val="360" w:hRule="auto"/>
         </w:trPr>
-        body 5
-        <w:tc>
-          <w:tcPr>
-            <w:tcBorders>
-              <w:bottom w:val="none" w:sz="0" w:space="0" w:color="000000"/>
-              <w:top w:val="none" w:sz="0" w:space="0" w:color="000000"/>
-              <w:left w:val="none" w:sz="0" w:space="0" w:color="000000"/>
-              <w:right w:val="none" w:sz="0" w:space="0" w:color="000000"/>
-            </w:tcBorders>
-            <w:shd w:val="clear" w:color="auto" w:fill="FFFFFF"/>
-            <w:tcMar>
-              <w:top w:w="0" w:type="dxa"/>
-              <w:bottom w:w="0" w:type="dxa"/>
-              <w:left w:w="0" w:type="dxa"/>
-              <w:right w:w="0" w:type="dxa"/>
-            </w:tcMar>
-            <w:vAlign w:val="center"/>
-          </w:tcPr>
-          <w:p>
-            <w:pPr>
+        <w:tc>
+          <w:tcPr>
+            <w:tcBorders>
+              <w:bottom w:val="none" w:sz="0" w:space="0" w:color="000000"/>
+              <w:top w:val="none" w:sz="0" w:space="0" w:color="000000"/>
+              <w:left w:val="none" w:sz="0" w:space="0" w:color="000000"/>
+              <w:right w:val="none" w:sz="0" w:space="0" w:color="000000"/>
+            </w:tcBorders>
+            <w:shd w:val="clear" w:color="auto" w:fill="FFFFFF"/>
+            <w:tcMar>
+              <w:top w:w="0" w:type="dxa"/>
+              <w:bottom w:w="0" w:type="dxa"/>
+              <w:left w:w="0" w:type="dxa"/>
+              <w:right w:w="0" w:type="dxa"/>
+            </w:tcMar>
+            <w:vAlign w:val="center"/>
+          </w:tcPr>
+          <w:p>
+            <w:pPr>
+              <w:pStyle w:val="Normal"/>
               <w:jc w:val="left"/>
               <w:pBdr>
                 <w:bottom w:val="none" w:sz="0" w:space="0" w:color="000000"/>
@@ -4084,6 +4130,7 @@
           </w:tcPr>
           <w:p>
             <w:pPr>
+              <w:pStyle w:val="Normal"/>
               <w:jc w:val="center"/>
               <w:pBdr>
                 <w:bottom w:val="none" w:sz="0" w:space="0" w:color="000000"/>
@@ -4138,6 +4185,7 @@
           </w:tcPr>
           <w:p>
             <w:pPr>
+              <w:pStyle w:val="Normal"/>
               <w:jc w:val="center"/>
               <w:pBdr>
                 <w:bottom w:val="none" w:sz="0" w:space="0" w:color="000000"/>
@@ -4178,26 +4226,26 @@
         <w:trPr>
           <w:trHeight w:val="360" w:hRule="auto"/>
         </w:trPr>
-        body 6
-        <w:tc>
-          <w:tcPr>
-            <w:tcBorders>
-              <w:bottom w:val="none" w:sz="0" w:space="0" w:color="000000"/>
-              <w:top w:val="none" w:sz="0" w:space="0" w:color="000000"/>
-              <w:left w:val="none" w:sz="0" w:space="0" w:color="000000"/>
-              <w:right w:val="none" w:sz="0" w:space="0" w:color="000000"/>
-            </w:tcBorders>
-            <w:shd w:val="clear" w:color="auto" w:fill="FFFFFF"/>
-            <w:tcMar>
-              <w:top w:w="0" w:type="dxa"/>
-              <w:bottom w:w="0" w:type="dxa"/>
-              <w:left w:w="0" w:type="dxa"/>
-              <w:right w:w="0" w:type="dxa"/>
-            </w:tcMar>
-            <w:vAlign w:val="center"/>
-          </w:tcPr>
-          <w:p>
-            <w:pPr>
+        <w:tc>
+          <w:tcPr>
+            <w:tcBorders>
+              <w:bottom w:val="none" w:sz="0" w:space="0" w:color="000000"/>
+              <w:top w:val="none" w:sz="0" w:space="0" w:color="000000"/>
+              <w:left w:val="none" w:sz="0" w:space="0" w:color="000000"/>
+              <w:right w:val="none" w:sz="0" w:space="0" w:color="000000"/>
+            </w:tcBorders>
+            <w:shd w:val="clear" w:color="auto" w:fill="FFFFFF"/>
+            <w:tcMar>
+              <w:top w:w="0" w:type="dxa"/>
+              <w:bottom w:w="0" w:type="dxa"/>
+              <w:left w:w="0" w:type="dxa"/>
+              <w:right w:w="0" w:type="dxa"/>
+            </w:tcMar>
+            <w:vAlign w:val="center"/>
+          </w:tcPr>
+          <w:p>
+            <w:pPr>
+              <w:pStyle w:val="Normal"/>
               <w:jc w:val="left"/>
               <w:pBdr>
                 <w:bottom w:val="none" w:sz="0" w:space="0" w:color="000000"/>
@@ -4252,6 +4300,7 @@
           </w:tcPr>
           <w:p>
             <w:pPr>
+              <w:pStyle w:val="Normal"/>
               <w:jc w:val="center"/>
               <w:pBdr>
                 <w:bottom w:val="none" w:sz="0" w:space="0" w:color="000000"/>
@@ -4306,6 +4355,7 @@
           </w:tcPr>
           <w:p>
             <w:pPr>
+              <w:pStyle w:val="Normal"/>
               <w:jc w:val="center"/>
               <w:pBdr>
                 <w:bottom w:val="none" w:sz="0" w:space="0" w:color="000000"/>
@@ -4346,26 +4396,26 @@
         <w:trPr>
           <w:trHeight w:val="360" w:hRule="auto"/>
         </w:trPr>
-        body 7
-        <w:tc>
-          <w:tcPr>
-            <w:tcBorders>
-              <w:bottom w:val="none" w:sz="0" w:space="0" w:color="000000"/>
-              <w:top w:val="none" w:sz="0" w:space="0" w:color="000000"/>
-              <w:left w:val="none" w:sz="0" w:space="0" w:color="000000"/>
-              <w:right w:val="none" w:sz="0" w:space="0" w:color="000000"/>
-            </w:tcBorders>
-            <w:shd w:val="clear" w:color="auto" w:fill="FFFFFF"/>
-            <w:tcMar>
-              <w:top w:w="0" w:type="dxa"/>
-              <w:bottom w:w="0" w:type="dxa"/>
-              <w:left w:w="0" w:type="dxa"/>
-              <w:right w:w="0" w:type="dxa"/>
-            </w:tcMar>
-            <w:vAlign w:val="center"/>
-          </w:tcPr>
-          <w:p>
-            <w:pPr>
+        <w:tc>
+          <w:tcPr>
+            <w:tcBorders>
+              <w:bottom w:val="none" w:sz="0" w:space="0" w:color="000000"/>
+              <w:top w:val="none" w:sz="0" w:space="0" w:color="000000"/>
+              <w:left w:val="none" w:sz="0" w:space="0" w:color="000000"/>
+              <w:right w:val="none" w:sz="0" w:space="0" w:color="000000"/>
+            </w:tcBorders>
+            <w:shd w:val="clear" w:color="auto" w:fill="FFFFFF"/>
+            <w:tcMar>
+              <w:top w:w="0" w:type="dxa"/>
+              <w:bottom w:w="0" w:type="dxa"/>
+              <w:left w:w="0" w:type="dxa"/>
+              <w:right w:w="0" w:type="dxa"/>
+            </w:tcMar>
+            <w:vAlign w:val="center"/>
+          </w:tcPr>
+          <w:p>
+            <w:pPr>
+              <w:pStyle w:val="Normal"/>
               <w:jc w:val="left"/>
               <w:pBdr>
                 <w:bottom w:val="none" w:sz="0" w:space="0" w:color="000000"/>
@@ -4420,6 +4470,7 @@
           </w:tcPr>
           <w:p>
             <w:pPr>
+              <w:pStyle w:val="Normal"/>
               <w:jc w:val="center"/>
               <w:pBdr>
                 <w:bottom w:val="none" w:sz="0" w:space="0" w:color="000000"/>
@@ -4474,6 +4525,7 @@
           </w:tcPr>
           <w:p>
             <w:pPr>
+              <w:pStyle w:val="Normal"/>
               <w:jc w:val="center"/>
               <w:pBdr>
                 <w:bottom w:val="none" w:sz="0" w:space="0" w:color="000000"/>
@@ -4514,26 +4566,26 @@
         <w:trPr>
           <w:trHeight w:val="360" w:hRule="auto"/>
         </w:trPr>
-        body 8
-        <w:tc>
-          <w:tcPr>
-            <w:tcBorders>
-              <w:bottom w:val="none" w:sz="0" w:space="0" w:color="000000"/>
-              <w:top w:val="none" w:sz="0" w:space="0" w:color="000000"/>
-              <w:left w:val="none" w:sz="0" w:space="0" w:color="000000"/>
-              <w:right w:val="none" w:sz="0" w:space="0" w:color="000000"/>
-            </w:tcBorders>
-            <w:shd w:val="clear" w:color="auto" w:fill="FFFFFF"/>
-            <w:tcMar>
-              <w:top w:w="0" w:type="dxa"/>
-              <w:bottom w:w="0" w:type="dxa"/>
-              <w:left w:w="0" w:type="dxa"/>
-              <w:right w:w="0" w:type="dxa"/>
-            </w:tcMar>
-            <w:vAlign w:val="center"/>
-          </w:tcPr>
-          <w:p>
-            <w:pPr>
+        <w:tc>
+          <w:tcPr>
+            <w:tcBorders>
+              <w:bottom w:val="none" w:sz="0" w:space="0" w:color="000000"/>
+              <w:top w:val="none" w:sz="0" w:space="0" w:color="000000"/>
+              <w:left w:val="none" w:sz="0" w:space="0" w:color="000000"/>
+              <w:right w:val="none" w:sz="0" w:space="0" w:color="000000"/>
+            </w:tcBorders>
+            <w:shd w:val="clear" w:color="auto" w:fill="FFFFFF"/>
+            <w:tcMar>
+              <w:top w:w="0" w:type="dxa"/>
+              <w:bottom w:w="0" w:type="dxa"/>
+              <w:left w:w="0" w:type="dxa"/>
+              <w:right w:w="0" w:type="dxa"/>
+            </w:tcMar>
+            <w:vAlign w:val="center"/>
+          </w:tcPr>
+          <w:p>
+            <w:pPr>
+              <w:pStyle w:val="Normal"/>
               <w:jc w:val="left"/>
               <w:pBdr>
                 <w:bottom w:val="none" w:sz="0" w:space="0" w:color="000000"/>
@@ -4588,6 +4640,7 @@
           </w:tcPr>
           <w:p>
             <w:pPr>
+              <w:pStyle w:val="Normal"/>
               <w:jc w:val="center"/>
               <w:pBdr>
                 <w:bottom w:val="none" w:sz="0" w:space="0" w:color="000000"/>
@@ -4642,6 +4695,7 @@
           </w:tcPr>
           <w:p>
             <w:pPr>
+              <w:pStyle w:val="Normal"/>
               <w:jc w:val="center"/>
               <w:pBdr>
                 <w:bottom w:val="none" w:sz="0" w:space="0" w:color="000000"/>
@@ -4682,26 +4736,26 @@
         <w:trPr>
           <w:trHeight w:val="360" w:hRule="auto"/>
         </w:trPr>
-        body 9
-        <w:tc>
-          <w:tcPr>
-            <w:tcBorders>
-              <w:bottom w:val="none" w:sz="0" w:space="0" w:color="000000"/>
-              <w:top w:val="none" w:sz="0" w:space="0" w:color="000000"/>
-              <w:left w:val="none" w:sz="0" w:space="0" w:color="000000"/>
-              <w:right w:val="none" w:sz="0" w:space="0" w:color="000000"/>
-            </w:tcBorders>
-            <w:shd w:val="clear" w:color="auto" w:fill="FFFFFF"/>
-            <w:tcMar>
-              <w:top w:w="0" w:type="dxa"/>
-              <w:bottom w:w="0" w:type="dxa"/>
-              <w:left w:w="0" w:type="dxa"/>
-              <w:right w:w="0" w:type="dxa"/>
-            </w:tcMar>
-            <w:vAlign w:val="center"/>
-          </w:tcPr>
-          <w:p>
-            <w:pPr>
+        <w:tc>
+          <w:tcPr>
+            <w:tcBorders>
+              <w:bottom w:val="none" w:sz="0" w:space="0" w:color="000000"/>
+              <w:top w:val="none" w:sz="0" w:space="0" w:color="000000"/>
+              <w:left w:val="none" w:sz="0" w:space="0" w:color="000000"/>
+              <w:right w:val="none" w:sz="0" w:space="0" w:color="000000"/>
+            </w:tcBorders>
+            <w:shd w:val="clear" w:color="auto" w:fill="FFFFFF"/>
+            <w:tcMar>
+              <w:top w:w="0" w:type="dxa"/>
+              <w:bottom w:w="0" w:type="dxa"/>
+              <w:left w:w="0" w:type="dxa"/>
+              <w:right w:w="0" w:type="dxa"/>
+            </w:tcMar>
+            <w:vAlign w:val="center"/>
+          </w:tcPr>
+          <w:p>
+            <w:pPr>
+              <w:pStyle w:val="Normal"/>
               <w:jc w:val="left"/>
               <w:pBdr>
                 <w:bottom w:val="none" w:sz="0" w:space="0" w:color="000000"/>
@@ -4756,6 +4810,7 @@
           </w:tcPr>
           <w:p>
             <w:pPr>
+              <w:pStyle w:val="Normal"/>
               <w:jc w:val="center"/>
               <w:pBdr>
                 <w:bottom w:val="none" w:sz="0" w:space="0" w:color="000000"/>
@@ -4810,6 +4865,7 @@
           </w:tcPr>
           <w:p>
             <w:pPr>
+              <w:pStyle w:val="Normal"/>
               <w:jc w:val="center"/>
               <w:pBdr>
                 <w:bottom w:val="none" w:sz="0" w:space="0" w:color="000000"/>
@@ -4850,7 +4906,6 @@
         <w:trPr>
           <w:trHeight w:val="360" w:hRule="auto"/>
         </w:trPr>
-        body10
         <w:tc>
           <w:tcPr>
             <w:tcBorders>
@@ -4870,6 +4925,7 @@
           </w:tcPr>
           <w:p>
             <w:pPr>
+              <w:pStyle w:val="Normal"/>
               <w:jc w:val="left"/>
               <w:pBdr>
                 <w:bottom w:val="none" w:sz="0" w:space="0" w:color="000000"/>
@@ -4924,6 +4980,7 @@
           </w:tcPr>
           <w:p>
             <w:pPr>
+              <w:pStyle w:val="Normal"/>
               <w:jc w:val="center"/>
               <w:pBdr>
                 <w:bottom w:val="none" w:sz="0" w:space="0" w:color="000000"/>
@@ -4978,6 +5035,7 @@
           </w:tcPr>
           <w:p>
             <w:pPr>
+              <w:pStyle w:val="Normal"/>
               <w:jc w:val="center"/>
               <w:pBdr>
                 <w:bottom w:val="none" w:sz="0" w:space="0" w:color="000000"/>
@@ -5018,7 +5076,6 @@
         <w:trPr>
           <w:trHeight w:val="360" w:hRule="auto"/>
         </w:trPr>
-        body11
         <w:tc>
           <w:tcPr>
             <w:tcBorders>
@@ -5038,6 +5095,7 @@
           </w:tcPr>
           <w:p>
             <w:pPr>
+              <w:pStyle w:val="Normal"/>
               <w:jc w:val="left"/>
               <w:pBdr>
                 <w:bottom w:val="none" w:sz="0" w:space="0" w:color="000000"/>
@@ -5092,6 +5150,7 @@
           </w:tcPr>
           <w:p>
             <w:pPr>
+              <w:pStyle w:val="Normal"/>
               <w:jc w:val="center"/>
               <w:pBdr>
                 <w:bottom w:val="none" w:sz="0" w:space="0" w:color="000000"/>
@@ -5146,6 +5205,7 @@
           </w:tcPr>
           <w:p>
             <w:pPr>
+              <w:pStyle w:val="Normal"/>
               <w:jc w:val="center"/>
               <w:pBdr>
                 <w:bottom w:val="none" w:sz="0" w:space="0" w:color="000000"/>
@@ -5186,26 +5246,26 @@
         <w:trPr>
           <w:trHeight w:val="360" w:hRule="auto"/>
         </w:trPr>
-        body12
-        <w:tc>
-          <w:tcPr>
-            <w:tcBorders>
-              <w:bottom w:val="none" w:sz="0" w:space="0" w:color="000000"/>
-              <w:top w:val="none" w:sz="0" w:space="0" w:color="000000"/>
-              <w:left w:val="none" w:sz="0" w:space="0" w:color="000000"/>
-              <w:right w:val="none" w:sz="0" w:space="0" w:color="000000"/>
-            </w:tcBorders>
-            <w:shd w:val="clear" w:color="auto" w:fill="FFFFFF"/>
-            <w:tcMar>
-              <w:top w:w="0" w:type="dxa"/>
-              <w:bottom w:w="0" w:type="dxa"/>
-              <w:left w:w="0" w:type="dxa"/>
-              <w:right w:w="0" w:type="dxa"/>
-            </w:tcMar>
-            <w:vAlign w:val="center"/>
-          </w:tcPr>
-          <w:p>
-            <w:pPr>
+        <w:tc>
+          <w:tcPr>
+            <w:tcBorders>
+              <w:bottom w:val="none" w:sz="0" w:space="0" w:color="000000"/>
+              <w:top w:val="none" w:sz="0" w:space="0" w:color="000000"/>
+              <w:left w:val="none" w:sz="0" w:space="0" w:color="000000"/>
+              <w:right w:val="none" w:sz="0" w:space="0" w:color="000000"/>
+            </w:tcBorders>
+            <w:shd w:val="clear" w:color="auto" w:fill="FFFFFF"/>
+            <w:tcMar>
+              <w:top w:w="0" w:type="dxa"/>
+              <w:bottom w:w="0" w:type="dxa"/>
+              <w:left w:w="0" w:type="dxa"/>
+              <w:right w:w="0" w:type="dxa"/>
+            </w:tcMar>
+            <w:vAlign w:val="center"/>
+          </w:tcPr>
+          <w:p>
+            <w:pPr>
+              <w:pStyle w:val="Normal"/>
               <w:jc w:val="left"/>
               <w:pBdr>
                 <w:bottom w:val="none" w:sz="0" w:space="0" w:color="000000"/>
@@ -5260,6 +5320,7 @@
           </w:tcPr>
           <w:p>
             <w:pPr>
+              <w:pStyle w:val="Normal"/>
               <w:jc w:val="center"/>
               <w:pBdr>
                 <w:bottom w:val="none" w:sz="0" w:space="0" w:color="000000"/>
@@ -5314,6 +5375,7 @@
           </w:tcPr>
           <w:p>
             <w:pPr>
+              <w:pStyle w:val="Normal"/>
               <w:jc w:val="center"/>
               <w:pBdr>
                 <w:bottom w:val="none" w:sz="0" w:space="0" w:color="000000"/>
@@ -5354,26 +5416,26 @@
         <w:trPr>
           <w:trHeight w:val="360" w:hRule="auto"/>
         </w:trPr>
-        body13
-        <w:tc>
-          <w:tcPr>
-            <w:tcBorders>
-              <w:bottom w:val="none" w:sz="0" w:space="0" w:color="000000"/>
-              <w:top w:val="none" w:sz="0" w:space="0" w:color="000000"/>
-              <w:left w:val="none" w:sz="0" w:space="0" w:color="000000"/>
-              <w:right w:val="none" w:sz="0" w:space="0" w:color="000000"/>
-            </w:tcBorders>
-            <w:shd w:val="clear" w:color="auto" w:fill="FFFFFF"/>
-            <w:tcMar>
-              <w:top w:w="0" w:type="dxa"/>
-              <w:bottom w:w="0" w:type="dxa"/>
-              <w:left w:w="0" w:type="dxa"/>
-              <w:right w:w="0" w:type="dxa"/>
-            </w:tcMar>
-            <w:vAlign w:val="center"/>
-          </w:tcPr>
-          <w:p>
-            <w:pPr>
+        <w:tc>
+          <w:tcPr>
+            <w:tcBorders>
+              <w:bottom w:val="none" w:sz="0" w:space="0" w:color="000000"/>
+              <w:top w:val="none" w:sz="0" w:space="0" w:color="000000"/>
+              <w:left w:val="none" w:sz="0" w:space="0" w:color="000000"/>
+              <w:right w:val="none" w:sz="0" w:space="0" w:color="000000"/>
+            </w:tcBorders>
+            <w:shd w:val="clear" w:color="auto" w:fill="FFFFFF"/>
+            <w:tcMar>
+              <w:top w:w="0" w:type="dxa"/>
+              <w:bottom w:w="0" w:type="dxa"/>
+              <w:left w:w="0" w:type="dxa"/>
+              <w:right w:w="0" w:type="dxa"/>
+            </w:tcMar>
+            <w:vAlign w:val="center"/>
+          </w:tcPr>
+          <w:p>
+            <w:pPr>
+              <w:pStyle w:val="Normal"/>
               <w:jc w:val="left"/>
               <w:pBdr>
                 <w:bottom w:val="none" w:sz="0" w:space="0" w:color="000000"/>
@@ -5428,6 +5490,7 @@
           </w:tcPr>
           <w:p>
             <w:pPr>
+              <w:pStyle w:val="Normal"/>
               <w:jc w:val="center"/>
               <w:pBdr>
                 <w:bottom w:val="none" w:sz="0" w:space="0" w:color="000000"/>
@@ -5482,6 +5545,7 @@
           </w:tcPr>
           <w:p>
             <w:pPr>
+              <w:pStyle w:val="Normal"/>
               <w:jc w:val="center"/>
               <w:pBdr>
                 <w:bottom w:val="none" w:sz="0" w:space="0" w:color="000000"/>
@@ -5522,26 +5586,26 @@
         <w:trPr>
           <w:trHeight w:val="360" w:hRule="auto"/>
         </w:trPr>
-        body14
-        <w:tc>
-          <w:tcPr>
-            <w:tcBorders>
-              <w:bottom w:val="none" w:sz="0" w:space="0" w:color="000000"/>
-              <w:top w:val="none" w:sz="0" w:space="0" w:color="000000"/>
-              <w:left w:val="none" w:sz="0" w:space="0" w:color="000000"/>
-              <w:right w:val="none" w:sz="0" w:space="0" w:color="000000"/>
-            </w:tcBorders>
-            <w:shd w:val="clear" w:color="auto" w:fill="FFFFFF"/>
-            <w:tcMar>
-              <w:top w:w="0" w:type="dxa"/>
-              <w:bottom w:w="0" w:type="dxa"/>
-              <w:left w:w="0" w:type="dxa"/>
-              <w:right w:w="0" w:type="dxa"/>
-            </w:tcMar>
-            <w:vAlign w:val="center"/>
-          </w:tcPr>
-          <w:p>
-            <w:pPr>
+        <w:tc>
+          <w:tcPr>
+            <w:tcBorders>
+              <w:bottom w:val="none" w:sz="0" w:space="0" w:color="000000"/>
+              <w:top w:val="none" w:sz="0" w:space="0" w:color="000000"/>
+              <w:left w:val="none" w:sz="0" w:space="0" w:color="000000"/>
+              <w:right w:val="none" w:sz="0" w:space="0" w:color="000000"/>
+            </w:tcBorders>
+            <w:shd w:val="clear" w:color="auto" w:fill="FFFFFF"/>
+            <w:tcMar>
+              <w:top w:w="0" w:type="dxa"/>
+              <w:bottom w:w="0" w:type="dxa"/>
+              <w:left w:w="0" w:type="dxa"/>
+              <w:right w:w="0" w:type="dxa"/>
+            </w:tcMar>
+            <w:vAlign w:val="center"/>
+          </w:tcPr>
+          <w:p>
+            <w:pPr>
+              <w:pStyle w:val="Normal"/>
               <w:jc w:val="left"/>
               <w:pBdr>
                 <w:bottom w:val="none" w:sz="0" w:space="0" w:color="000000"/>
@@ -5596,6 +5660,7 @@
           </w:tcPr>
           <w:p>
             <w:pPr>
+              <w:pStyle w:val="Normal"/>
               <w:jc w:val="center"/>
               <w:pBdr>
                 <w:bottom w:val="none" w:sz="0" w:space="0" w:color="000000"/>
@@ -5650,6 +5715,7 @@
           </w:tcPr>
           <w:p>
             <w:pPr>
+              <w:pStyle w:val="Normal"/>
               <w:jc w:val="center"/>
               <w:pBdr>
                 <w:bottom w:val="none" w:sz="0" w:space="0" w:color="000000"/>
@@ -5690,26 +5756,26 @@
         <w:trPr>
           <w:trHeight w:val="360" w:hRule="auto"/>
         </w:trPr>
-        body15
-        <w:tc>
-          <w:tcPr>
-            <w:tcBorders>
-              <w:bottom w:val="none" w:sz="0" w:space="0" w:color="000000"/>
-              <w:top w:val="none" w:sz="0" w:space="0" w:color="000000"/>
-              <w:left w:val="none" w:sz="0" w:space="0" w:color="000000"/>
-              <w:right w:val="none" w:sz="0" w:space="0" w:color="000000"/>
-            </w:tcBorders>
-            <w:shd w:val="clear" w:color="auto" w:fill="FFFFFF"/>
-            <w:tcMar>
-              <w:top w:w="0" w:type="dxa"/>
-              <w:bottom w:w="0" w:type="dxa"/>
-              <w:left w:w="0" w:type="dxa"/>
-              <w:right w:w="0" w:type="dxa"/>
-            </w:tcMar>
-            <w:vAlign w:val="center"/>
-          </w:tcPr>
-          <w:p>
-            <w:pPr>
+        <w:tc>
+          <w:tcPr>
+            <w:tcBorders>
+              <w:bottom w:val="none" w:sz="0" w:space="0" w:color="000000"/>
+              <w:top w:val="none" w:sz="0" w:space="0" w:color="000000"/>
+              <w:left w:val="none" w:sz="0" w:space="0" w:color="000000"/>
+              <w:right w:val="none" w:sz="0" w:space="0" w:color="000000"/>
+            </w:tcBorders>
+            <w:shd w:val="clear" w:color="auto" w:fill="FFFFFF"/>
+            <w:tcMar>
+              <w:top w:w="0" w:type="dxa"/>
+              <w:bottom w:w="0" w:type="dxa"/>
+              <w:left w:w="0" w:type="dxa"/>
+              <w:right w:w="0" w:type="dxa"/>
+            </w:tcMar>
+            <w:vAlign w:val="center"/>
+          </w:tcPr>
+          <w:p>
+            <w:pPr>
+              <w:pStyle w:val="Normal"/>
               <w:jc w:val="left"/>
               <w:pBdr>
                 <w:bottom w:val="none" w:sz="0" w:space="0" w:color="000000"/>
@@ -5764,6 +5830,7 @@
           </w:tcPr>
           <w:p>
             <w:pPr>
+              <w:pStyle w:val="Normal"/>
               <w:jc w:val="center"/>
               <w:pBdr>
                 <w:bottom w:val="none" w:sz="0" w:space="0" w:color="000000"/>
@@ -5818,6 +5885,7 @@
           </w:tcPr>
           <w:p>
             <w:pPr>
+              <w:pStyle w:val="Normal"/>
               <w:jc w:val="center"/>
               <w:pBdr>
                 <w:bottom w:val="none" w:sz="0" w:space="0" w:color="000000"/>
@@ -5858,26 +5926,26 @@
         <w:trPr>
           <w:trHeight w:val="360" w:hRule="auto"/>
         </w:trPr>
-        body16
-        <w:tc>
-          <w:tcPr>
-            <w:tcBorders>
-              <w:bottom w:val="none" w:sz="0" w:space="0" w:color="000000"/>
-              <w:top w:val="none" w:sz="0" w:space="0" w:color="000000"/>
-              <w:left w:val="none" w:sz="0" w:space="0" w:color="000000"/>
-              <w:right w:val="none" w:sz="0" w:space="0" w:color="000000"/>
-            </w:tcBorders>
-            <w:shd w:val="clear" w:color="auto" w:fill="FFFFFF"/>
-            <w:tcMar>
-              <w:top w:w="0" w:type="dxa"/>
-              <w:bottom w:w="0" w:type="dxa"/>
-              <w:left w:w="0" w:type="dxa"/>
-              <w:right w:w="0" w:type="dxa"/>
-            </w:tcMar>
-            <w:vAlign w:val="center"/>
-          </w:tcPr>
-          <w:p>
-            <w:pPr>
+        <w:tc>
+          <w:tcPr>
+            <w:tcBorders>
+              <w:bottom w:val="none" w:sz="0" w:space="0" w:color="000000"/>
+              <w:top w:val="none" w:sz="0" w:space="0" w:color="000000"/>
+              <w:left w:val="none" w:sz="0" w:space="0" w:color="000000"/>
+              <w:right w:val="none" w:sz="0" w:space="0" w:color="000000"/>
+            </w:tcBorders>
+            <w:shd w:val="clear" w:color="auto" w:fill="FFFFFF"/>
+            <w:tcMar>
+              <w:top w:w="0" w:type="dxa"/>
+              <w:bottom w:w="0" w:type="dxa"/>
+              <w:left w:w="0" w:type="dxa"/>
+              <w:right w:w="0" w:type="dxa"/>
+            </w:tcMar>
+            <w:vAlign w:val="center"/>
+          </w:tcPr>
+          <w:p>
+            <w:pPr>
+              <w:pStyle w:val="Normal"/>
               <w:jc w:val="left"/>
               <w:pBdr>
                 <w:bottom w:val="none" w:sz="0" w:space="0" w:color="000000"/>
@@ -5932,6 +6000,7 @@
           </w:tcPr>
           <w:p>
             <w:pPr>
+              <w:pStyle w:val="Normal"/>
               <w:jc w:val="center"/>
               <w:pBdr>
                 <w:bottom w:val="none" w:sz="0" w:space="0" w:color="000000"/>
@@ -5986,6 +6055,7 @@
           </w:tcPr>
           <w:p>
             <w:pPr>
+              <w:pStyle w:val="Normal"/>
               <w:jc w:val="center"/>
               <w:pBdr>
                 <w:bottom w:val="none" w:sz="0" w:space="0" w:color="000000"/>
@@ -6026,7 +6096,6 @@
         <w:trPr>
           <w:trHeight w:val="360" w:hRule="auto"/>
         </w:trPr>
-        body17
         <w:tc>
           <w:tcPr>
             <w:tcBorders>
@@ -6046,6 +6115,7 @@
           </w:tcPr>
           <w:p>
             <w:pPr>
+              <w:pStyle w:val="Normal"/>
               <w:jc w:val="left"/>
               <w:pBdr>
                 <w:bottom w:val="none" w:sz="0" w:space="0" w:color="000000"/>
@@ -6100,6 +6170,7 @@
           </w:tcPr>
           <w:p>
             <w:pPr>
+              <w:pStyle w:val="Normal"/>
               <w:jc w:val="center"/>
               <w:pBdr>
                 <w:bottom w:val="none" w:sz="0" w:space="0" w:color="000000"/>
@@ -6154,6 +6225,7 @@
           </w:tcPr>
           <w:p>
             <w:pPr>
+              <w:pStyle w:val="Normal"/>
               <w:jc w:val="center"/>
               <w:pBdr>
                 <w:bottom w:val="none" w:sz="0" w:space="0" w:color="000000"/>
@@ -6194,7 +6266,6 @@
         <w:trPr>
           <w:trHeight w:val="360" w:hRule="auto"/>
         </w:trPr>
-        footer 1
         <w:tc>
           <w:tcPr>
             <w:gridSpan w:val="3"/>
@@ -6215,6 +6286,7 @@
           </w:tcPr>
           <w:p>
             <w:pPr>
+              <w:pStyle w:val="Normal"/>
               <w:jc w:val="left"/>
               <w:pBdr>
                 <w:bottom w:val="none" w:sz="0" w:space="0" w:color="000000"/>
@@ -6295,7 +6367,6 @@
           <w:trHeight w:val="360" w:hRule="auto"/>
           <w:tblHeader/>
         </w:trPr>
-        header 1
         <w:tc>
           <w:tcPr>
             <w:tcBorders>
@@ -6315,6 +6386,7 @@
           </w:tcPr>
           <w:p>
             <w:pPr>
+              <w:pStyle w:val="Normal"/>
               <w:jc w:val="left"/>
               <w:pBdr>
                 <w:bottom w:val="none" w:sz="0" w:space="0" w:color="000000"/>
@@ -6369,6 +6441,7 @@
           </w:tcPr>
           <w:p>
             <w:pPr>
+              <w:pStyle w:val="Normal"/>
               <w:jc w:val="center"/>
               <w:pBdr>
                 <w:bottom w:val="none" w:sz="0" w:space="0" w:color="000000"/>
@@ -6423,6 +6496,7 @@
           </w:tcPr>
           <w:p>
             <w:pPr>
+              <w:pStyle w:val="Normal"/>
               <w:jc w:val="center"/>
               <w:pBdr>
                 <w:bottom w:val="none" w:sz="0" w:space="0" w:color="000000"/>
@@ -6463,7 +6537,6 @@
         <w:trPr>
           <w:trHeight w:val="360" w:hRule="auto"/>
         </w:trPr>
-        body 1
         <w:tc>
           <w:tcPr>
             <w:tcBorders>
@@ -6483,6 +6556,7 @@
           </w:tcPr>
           <w:p>
             <w:pPr>
+              <w:pStyle w:val="Normal"/>
               <w:jc w:val="left"/>
               <w:pBdr>
                 <w:bottom w:val="none" w:sz="0" w:space="0" w:color="000000"/>
@@ -6537,6 +6611,7 @@
           </w:tcPr>
           <w:p>
             <w:pPr>
+              <w:pStyle w:val="Normal"/>
               <w:jc w:val="center"/>
               <w:pBdr>
                 <w:bottom w:val="none" w:sz="0" w:space="0" w:color="000000"/>
@@ -6591,6 +6666,7 @@
           </w:tcPr>
           <w:p>
             <w:pPr>
+              <w:pStyle w:val="Normal"/>
               <w:jc w:val="center"/>
               <w:pBdr>
                 <w:bottom w:val="none" w:sz="0" w:space="0" w:color="000000"/>
@@ -6631,26 +6707,26 @@
         <w:trPr>
           <w:trHeight w:val="360" w:hRule="auto"/>
         </w:trPr>
-        body 2
-        <w:tc>
-          <w:tcPr>
-            <w:tcBorders>
-              <w:bottom w:val="none" w:sz="0" w:space="0" w:color="000000"/>
-              <w:top w:val="none" w:sz="0" w:space="0" w:color="000000"/>
-              <w:left w:val="none" w:sz="0" w:space="0" w:color="000000"/>
-              <w:right w:val="none" w:sz="0" w:space="0" w:color="000000"/>
-            </w:tcBorders>
-            <w:shd w:val="clear" w:color="auto" w:fill="FFFFFF"/>
-            <w:tcMar>
-              <w:top w:w="0" w:type="dxa"/>
-              <w:bottom w:w="0" w:type="dxa"/>
-              <w:left w:w="0" w:type="dxa"/>
-              <w:right w:w="0" w:type="dxa"/>
-            </w:tcMar>
-            <w:vAlign w:val="center"/>
-          </w:tcPr>
-          <w:p>
-            <w:pPr>
+        <w:tc>
+          <w:tcPr>
+            <w:tcBorders>
+              <w:bottom w:val="none" w:sz="0" w:space="0" w:color="000000"/>
+              <w:top w:val="none" w:sz="0" w:space="0" w:color="000000"/>
+              <w:left w:val="none" w:sz="0" w:space="0" w:color="000000"/>
+              <w:right w:val="none" w:sz="0" w:space="0" w:color="000000"/>
+            </w:tcBorders>
+            <w:shd w:val="clear" w:color="auto" w:fill="FFFFFF"/>
+            <w:tcMar>
+              <w:top w:w="0" w:type="dxa"/>
+              <w:bottom w:w="0" w:type="dxa"/>
+              <w:left w:w="0" w:type="dxa"/>
+              <w:right w:w="0" w:type="dxa"/>
+            </w:tcMar>
+            <w:vAlign w:val="center"/>
+          </w:tcPr>
+          <w:p>
+            <w:pPr>
+              <w:pStyle w:val="Normal"/>
               <w:jc w:val="left"/>
               <w:pBdr>
                 <w:bottom w:val="none" w:sz="0" w:space="0" w:color="000000"/>
@@ -6705,6 +6781,7 @@
           </w:tcPr>
           <w:p>
             <w:pPr>
+              <w:pStyle w:val="Normal"/>
               <w:jc w:val="center"/>
               <w:pBdr>
                 <w:bottom w:val="none" w:sz="0" w:space="0" w:color="000000"/>
@@ -6759,6 +6836,7 @@
           </w:tcPr>
           <w:p>
             <w:pPr>
+              <w:pStyle w:val="Normal"/>
               <w:jc w:val="center"/>
               <w:pBdr>
                 <w:bottom w:val="none" w:sz="0" w:space="0" w:color="000000"/>
@@ -6799,26 +6877,26 @@
         <w:trPr>
           <w:trHeight w:val="360" w:hRule="auto"/>
         </w:trPr>
-        body 3
-        <w:tc>
-          <w:tcPr>
-            <w:tcBorders>
-              <w:bottom w:val="none" w:sz="0" w:space="0" w:color="000000"/>
-              <w:top w:val="none" w:sz="0" w:space="0" w:color="000000"/>
-              <w:left w:val="none" w:sz="0" w:space="0" w:color="000000"/>
-              <w:right w:val="none" w:sz="0" w:space="0" w:color="000000"/>
-            </w:tcBorders>
-            <w:shd w:val="clear" w:color="auto" w:fill="FFFFFF"/>
-            <w:tcMar>
-              <w:top w:w="0" w:type="dxa"/>
-              <w:bottom w:w="0" w:type="dxa"/>
-              <w:left w:w="0" w:type="dxa"/>
-              <w:right w:w="0" w:type="dxa"/>
-            </w:tcMar>
-            <w:vAlign w:val="center"/>
-          </w:tcPr>
-          <w:p>
-            <w:pPr>
+        <w:tc>
+          <w:tcPr>
+            <w:tcBorders>
+              <w:bottom w:val="none" w:sz="0" w:space="0" w:color="000000"/>
+              <w:top w:val="none" w:sz="0" w:space="0" w:color="000000"/>
+              <w:left w:val="none" w:sz="0" w:space="0" w:color="000000"/>
+              <w:right w:val="none" w:sz="0" w:space="0" w:color="000000"/>
+            </w:tcBorders>
+            <w:shd w:val="clear" w:color="auto" w:fill="FFFFFF"/>
+            <w:tcMar>
+              <w:top w:w="0" w:type="dxa"/>
+              <w:bottom w:w="0" w:type="dxa"/>
+              <w:left w:w="0" w:type="dxa"/>
+              <w:right w:w="0" w:type="dxa"/>
+            </w:tcMar>
+            <w:vAlign w:val="center"/>
+          </w:tcPr>
+          <w:p>
+            <w:pPr>
+              <w:pStyle w:val="Normal"/>
               <w:jc w:val="left"/>
               <w:pBdr>
                 <w:bottom w:val="none" w:sz="0" w:space="0" w:color="000000"/>
@@ -6873,6 +6951,7 @@
           </w:tcPr>
           <w:p>
             <w:pPr>
+              <w:pStyle w:val="Normal"/>
               <w:jc w:val="center"/>
               <w:pBdr>
                 <w:bottom w:val="none" w:sz="0" w:space="0" w:color="000000"/>
@@ -6927,6 +7006,7 @@
           </w:tcPr>
           <w:p>
             <w:pPr>
+              <w:pStyle w:val="Normal"/>
               <w:jc w:val="center"/>
               <w:pBdr>
                 <w:bottom w:val="none" w:sz="0" w:space="0" w:color="000000"/>
@@ -6967,26 +7047,26 @@
         <w:trPr>
           <w:trHeight w:val="360" w:hRule="auto"/>
         </w:trPr>
-        body 4
-        <w:tc>
-          <w:tcPr>
-            <w:tcBorders>
-              <w:bottom w:val="none" w:sz="0" w:space="0" w:color="000000"/>
-              <w:top w:val="none" w:sz="0" w:space="0" w:color="000000"/>
-              <w:left w:val="none" w:sz="0" w:space="0" w:color="000000"/>
-              <w:right w:val="none" w:sz="0" w:space="0" w:color="000000"/>
-            </w:tcBorders>
-            <w:shd w:val="clear" w:color="auto" w:fill="FFFFFF"/>
-            <w:tcMar>
-              <w:top w:w="0" w:type="dxa"/>
-              <w:bottom w:w="0" w:type="dxa"/>
-              <w:left w:w="0" w:type="dxa"/>
-              <w:right w:w="0" w:type="dxa"/>
-            </w:tcMar>
-            <w:vAlign w:val="center"/>
-          </w:tcPr>
-          <w:p>
-            <w:pPr>
+        <w:tc>
+          <w:tcPr>
+            <w:tcBorders>
+              <w:bottom w:val="none" w:sz="0" w:space="0" w:color="000000"/>
+              <w:top w:val="none" w:sz="0" w:space="0" w:color="000000"/>
+              <w:left w:val="none" w:sz="0" w:space="0" w:color="000000"/>
+              <w:right w:val="none" w:sz="0" w:space="0" w:color="000000"/>
+            </w:tcBorders>
+            <w:shd w:val="clear" w:color="auto" w:fill="FFFFFF"/>
+            <w:tcMar>
+              <w:top w:w="0" w:type="dxa"/>
+              <w:bottom w:w="0" w:type="dxa"/>
+              <w:left w:w="0" w:type="dxa"/>
+              <w:right w:w="0" w:type="dxa"/>
+            </w:tcMar>
+            <w:vAlign w:val="center"/>
+          </w:tcPr>
+          <w:p>
+            <w:pPr>
+              <w:pStyle w:val="Normal"/>
               <w:jc w:val="left"/>
               <w:pBdr>
                 <w:bottom w:val="none" w:sz="0" w:space="0" w:color="000000"/>
@@ -7041,6 +7121,7 @@
           </w:tcPr>
           <w:p>
             <w:pPr>
+              <w:pStyle w:val="Normal"/>
               <w:jc w:val="center"/>
               <w:pBdr>
                 <w:bottom w:val="none" w:sz="0" w:space="0" w:color="000000"/>
@@ -7095,6 +7176,7 @@
           </w:tcPr>
           <w:p>
             <w:pPr>
+              <w:pStyle w:val="Normal"/>
               <w:jc w:val="center"/>
               <w:pBdr>
                 <w:bottom w:val="none" w:sz="0" w:space="0" w:color="000000"/>
@@ -7135,26 +7217,26 @@
         <w:trPr>
           <w:trHeight w:val="360" w:hRule="auto"/>
         </w:trPr>
-        body 5
-        <w:tc>
-          <w:tcPr>
-            <w:tcBorders>
-              <w:bottom w:val="none" w:sz="0" w:space="0" w:color="000000"/>
-              <w:top w:val="none" w:sz="0" w:space="0" w:color="000000"/>
-              <w:left w:val="none" w:sz="0" w:space="0" w:color="000000"/>
-              <w:right w:val="none" w:sz="0" w:space="0" w:color="000000"/>
-            </w:tcBorders>
-            <w:shd w:val="clear" w:color="auto" w:fill="FFFFFF"/>
-            <w:tcMar>
-              <w:top w:w="0" w:type="dxa"/>
-              <w:bottom w:w="0" w:type="dxa"/>
-              <w:left w:w="0" w:type="dxa"/>
-              <w:right w:w="0" w:type="dxa"/>
-            </w:tcMar>
-            <w:vAlign w:val="center"/>
-          </w:tcPr>
-          <w:p>
-            <w:pPr>
+        <w:tc>
+          <w:tcPr>
+            <w:tcBorders>
+              <w:bottom w:val="none" w:sz="0" w:space="0" w:color="000000"/>
+              <w:top w:val="none" w:sz="0" w:space="0" w:color="000000"/>
+              <w:left w:val="none" w:sz="0" w:space="0" w:color="000000"/>
+              <w:right w:val="none" w:sz="0" w:space="0" w:color="000000"/>
+            </w:tcBorders>
+            <w:shd w:val="clear" w:color="auto" w:fill="FFFFFF"/>
+            <w:tcMar>
+              <w:top w:w="0" w:type="dxa"/>
+              <w:bottom w:w="0" w:type="dxa"/>
+              <w:left w:w="0" w:type="dxa"/>
+              <w:right w:w="0" w:type="dxa"/>
+            </w:tcMar>
+            <w:vAlign w:val="center"/>
+          </w:tcPr>
+          <w:p>
+            <w:pPr>
+              <w:pStyle w:val="Normal"/>
               <w:jc w:val="left"/>
               <w:pBdr>
                 <w:bottom w:val="none" w:sz="0" w:space="0" w:color="000000"/>
@@ -7209,6 +7291,7 @@
           </w:tcPr>
           <w:p>
             <w:pPr>
+              <w:pStyle w:val="Normal"/>
               <w:jc w:val="center"/>
               <w:pBdr>
                 <w:bottom w:val="none" w:sz="0" w:space="0" w:color="000000"/>
@@ -7263,6 +7346,7 @@
           </w:tcPr>
           <w:p>
             <w:pPr>
+              <w:pStyle w:val="Normal"/>
               <w:jc w:val="center"/>
               <w:pBdr>
                 <w:bottom w:val="none" w:sz="0" w:space="0" w:color="000000"/>
@@ -7303,26 +7387,26 @@
         <w:trPr>
           <w:trHeight w:val="360" w:hRule="auto"/>
         </w:trPr>
-        body 6
-        <w:tc>
-          <w:tcPr>
-            <w:tcBorders>
-              <w:bottom w:val="none" w:sz="0" w:space="0" w:color="000000"/>
-              <w:top w:val="none" w:sz="0" w:space="0" w:color="000000"/>
-              <w:left w:val="none" w:sz="0" w:space="0" w:color="000000"/>
-              <w:right w:val="none" w:sz="0" w:space="0" w:color="000000"/>
-            </w:tcBorders>
-            <w:shd w:val="clear" w:color="auto" w:fill="FFFFFF"/>
-            <w:tcMar>
-              <w:top w:w="0" w:type="dxa"/>
-              <w:bottom w:w="0" w:type="dxa"/>
-              <w:left w:w="0" w:type="dxa"/>
-              <w:right w:w="0" w:type="dxa"/>
-            </w:tcMar>
-            <w:vAlign w:val="center"/>
-          </w:tcPr>
-          <w:p>
-            <w:pPr>
+        <w:tc>
+          <w:tcPr>
+            <w:tcBorders>
+              <w:bottom w:val="none" w:sz="0" w:space="0" w:color="000000"/>
+              <w:top w:val="none" w:sz="0" w:space="0" w:color="000000"/>
+              <w:left w:val="none" w:sz="0" w:space="0" w:color="000000"/>
+              <w:right w:val="none" w:sz="0" w:space="0" w:color="000000"/>
+            </w:tcBorders>
+            <w:shd w:val="clear" w:color="auto" w:fill="FFFFFF"/>
+            <w:tcMar>
+              <w:top w:w="0" w:type="dxa"/>
+              <w:bottom w:w="0" w:type="dxa"/>
+              <w:left w:w="0" w:type="dxa"/>
+              <w:right w:w="0" w:type="dxa"/>
+            </w:tcMar>
+            <w:vAlign w:val="center"/>
+          </w:tcPr>
+          <w:p>
+            <w:pPr>
+              <w:pStyle w:val="Normal"/>
               <w:jc w:val="left"/>
               <w:pBdr>
                 <w:bottom w:val="none" w:sz="0" w:space="0" w:color="000000"/>
@@ -7377,6 +7461,7 @@
           </w:tcPr>
           <w:p>
             <w:pPr>
+              <w:pStyle w:val="Normal"/>
               <w:jc w:val="center"/>
               <w:pBdr>
                 <w:bottom w:val="none" w:sz="0" w:space="0" w:color="000000"/>
@@ -7431,6 +7516,7 @@
           </w:tcPr>
           <w:p>
             <w:pPr>
+              <w:pStyle w:val="Normal"/>
               <w:jc w:val="center"/>
               <w:pBdr>
                 <w:bottom w:val="none" w:sz="0" w:space="0" w:color="000000"/>
@@ -7471,26 +7557,26 @@
         <w:trPr>
           <w:trHeight w:val="360" w:hRule="auto"/>
         </w:trPr>
-        body 7
-        <w:tc>
-          <w:tcPr>
-            <w:tcBorders>
-              <w:bottom w:val="none" w:sz="0" w:space="0" w:color="000000"/>
-              <w:top w:val="none" w:sz="0" w:space="0" w:color="000000"/>
-              <w:left w:val="none" w:sz="0" w:space="0" w:color="000000"/>
-              <w:right w:val="none" w:sz="0" w:space="0" w:color="000000"/>
-            </w:tcBorders>
-            <w:shd w:val="clear" w:color="auto" w:fill="FFFFFF"/>
-            <w:tcMar>
-              <w:top w:w="0" w:type="dxa"/>
-              <w:bottom w:w="0" w:type="dxa"/>
-              <w:left w:w="0" w:type="dxa"/>
-              <w:right w:w="0" w:type="dxa"/>
-            </w:tcMar>
-            <w:vAlign w:val="center"/>
-          </w:tcPr>
-          <w:p>
-            <w:pPr>
+        <w:tc>
+          <w:tcPr>
+            <w:tcBorders>
+              <w:bottom w:val="none" w:sz="0" w:space="0" w:color="000000"/>
+              <w:top w:val="none" w:sz="0" w:space="0" w:color="000000"/>
+              <w:left w:val="none" w:sz="0" w:space="0" w:color="000000"/>
+              <w:right w:val="none" w:sz="0" w:space="0" w:color="000000"/>
+            </w:tcBorders>
+            <w:shd w:val="clear" w:color="auto" w:fill="FFFFFF"/>
+            <w:tcMar>
+              <w:top w:w="0" w:type="dxa"/>
+              <w:bottom w:w="0" w:type="dxa"/>
+              <w:left w:w="0" w:type="dxa"/>
+              <w:right w:w="0" w:type="dxa"/>
+            </w:tcMar>
+            <w:vAlign w:val="center"/>
+          </w:tcPr>
+          <w:p>
+            <w:pPr>
+              <w:pStyle w:val="Normal"/>
               <w:jc w:val="left"/>
               <w:pBdr>
                 <w:bottom w:val="none" w:sz="0" w:space="0" w:color="000000"/>
@@ -7545,6 +7631,7 @@
           </w:tcPr>
           <w:p>
             <w:pPr>
+              <w:pStyle w:val="Normal"/>
               <w:jc w:val="center"/>
               <w:pBdr>
                 <w:bottom w:val="none" w:sz="0" w:space="0" w:color="000000"/>
@@ -7599,6 +7686,7 @@
           </w:tcPr>
           <w:p>
             <w:pPr>
+              <w:pStyle w:val="Normal"/>
               <w:jc w:val="center"/>
               <w:pBdr>
                 <w:bottom w:val="none" w:sz="0" w:space="0" w:color="000000"/>
@@ -7639,26 +7727,26 @@
         <w:trPr>
           <w:trHeight w:val="360" w:hRule="auto"/>
         </w:trPr>
-        body 8
-        <w:tc>
-          <w:tcPr>
-            <w:tcBorders>
-              <w:bottom w:val="none" w:sz="0" w:space="0" w:color="000000"/>
-              <w:top w:val="none" w:sz="0" w:space="0" w:color="000000"/>
-              <w:left w:val="none" w:sz="0" w:space="0" w:color="000000"/>
-              <w:right w:val="none" w:sz="0" w:space="0" w:color="000000"/>
-            </w:tcBorders>
-            <w:shd w:val="clear" w:color="auto" w:fill="FFFFFF"/>
-            <w:tcMar>
-              <w:top w:w="0" w:type="dxa"/>
-              <w:bottom w:w="0" w:type="dxa"/>
-              <w:left w:w="0" w:type="dxa"/>
-              <w:right w:w="0" w:type="dxa"/>
-            </w:tcMar>
-            <w:vAlign w:val="center"/>
-          </w:tcPr>
-          <w:p>
-            <w:pPr>
+        <w:tc>
+          <w:tcPr>
+            <w:tcBorders>
+              <w:bottom w:val="none" w:sz="0" w:space="0" w:color="000000"/>
+              <w:top w:val="none" w:sz="0" w:space="0" w:color="000000"/>
+              <w:left w:val="none" w:sz="0" w:space="0" w:color="000000"/>
+              <w:right w:val="none" w:sz="0" w:space="0" w:color="000000"/>
+            </w:tcBorders>
+            <w:shd w:val="clear" w:color="auto" w:fill="FFFFFF"/>
+            <w:tcMar>
+              <w:top w:w="0" w:type="dxa"/>
+              <w:bottom w:w="0" w:type="dxa"/>
+              <w:left w:w="0" w:type="dxa"/>
+              <w:right w:w="0" w:type="dxa"/>
+            </w:tcMar>
+            <w:vAlign w:val="center"/>
+          </w:tcPr>
+          <w:p>
+            <w:pPr>
+              <w:pStyle w:val="Normal"/>
               <w:jc w:val="left"/>
               <w:pBdr>
                 <w:bottom w:val="none" w:sz="0" w:space="0" w:color="000000"/>
@@ -7713,6 +7801,7 @@
           </w:tcPr>
           <w:p>
             <w:pPr>
+              <w:pStyle w:val="Normal"/>
               <w:jc w:val="center"/>
               <w:pBdr>
                 <w:bottom w:val="none" w:sz="0" w:space="0" w:color="000000"/>
@@ -7767,6 +7856,7 @@
           </w:tcPr>
           <w:p>
             <w:pPr>
+              <w:pStyle w:val="Normal"/>
               <w:jc w:val="center"/>
               <w:pBdr>
                 <w:bottom w:val="none" w:sz="0" w:space="0" w:color="000000"/>
@@ -7807,26 +7897,26 @@
         <w:trPr>
           <w:trHeight w:val="360" w:hRule="auto"/>
         </w:trPr>
-        body 9
-        <w:tc>
-          <w:tcPr>
-            <w:tcBorders>
-              <w:bottom w:val="none" w:sz="0" w:space="0" w:color="000000"/>
-              <w:top w:val="none" w:sz="0" w:space="0" w:color="000000"/>
-              <w:left w:val="none" w:sz="0" w:space="0" w:color="000000"/>
-              <w:right w:val="none" w:sz="0" w:space="0" w:color="000000"/>
-            </w:tcBorders>
-            <w:shd w:val="clear" w:color="auto" w:fill="FFFFFF"/>
-            <w:tcMar>
-              <w:top w:w="0" w:type="dxa"/>
-              <w:bottom w:w="0" w:type="dxa"/>
-              <w:left w:w="0" w:type="dxa"/>
-              <w:right w:w="0" w:type="dxa"/>
-            </w:tcMar>
-            <w:vAlign w:val="center"/>
-          </w:tcPr>
-          <w:p>
-            <w:pPr>
+        <w:tc>
+          <w:tcPr>
+            <w:tcBorders>
+              <w:bottom w:val="none" w:sz="0" w:space="0" w:color="000000"/>
+              <w:top w:val="none" w:sz="0" w:space="0" w:color="000000"/>
+              <w:left w:val="none" w:sz="0" w:space="0" w:color="000000"/>
+              <w:right w:val="none" w:sz="0" w:space="0" w:color="000000"/>
+            </w:tcBorders>
+            <w:shd w:val="clear" w:color="auto" w:fill="FFFFFF"/>
+            <w:tcMar>
+              <w:top w:w="0" w:type="dxa"/>
+              <w:bottom w:w="0" w:type="dxa"/>
+              <w:left w:w="0" w:type="dxa"/>
+              <w:right w:w="0" w:type="dxa"/>
+            </w:tcMar>
+            <w:vAlign w:val="center"/>
+          </w:tcPr>
+          <w:p>
+            <w:pPr>
+              <w:pStyle w:val="Normal"/>
               <w:jc w:val="left"/>
               <w:pBdr>
                 <w:bottom w:val="none" w:sz="0" w:space="0" w:color="000000"/>
@@ -7881,6 +7971,7 @@
           </w:tcPr>
           <w:p>
             <w:pPr>
+              <w:pStyle w:val="Normal"/>
               <w:jc w:val="center"/>
               <w:pBdr>
                 <w:bottom w:val="none" w:sz="0" w:space="0" w:color="000000"/>
@@ -7935,6 +8026,7 @@
           </w:tcPr>
           <w:p>
             <w:pPr>
+              <w:pStyle w:val="Normal"/>
               <w:jc w:val="center"/>
               <w:pBdr>
                 <w:bottom w:val="none" w:sz="0" w:space="0" w:color="000000"/>
@@ -7975,7 +8067,6 @@
         <w:trPr>
           <w:trHeight w:val="360" w:hRule="auto"/>
         </w:trPr>
-        body10
         <w:tc>
           <w:tcPr>
             <w:tcBorders>
@@ -7995,6 +8086,7 @@
           </w:tcPr>
           <w:p>
             <w:pPr>
+              <w:pStyle w:val="Normal"/>
               <w:jc w:val="left"/>
               <w:pBdr>
                 <w:bottom w:val="none" w:sz="0" w:space="0" w:color="000000"/>
@@ -8049,6 +8141,7 @@
           </w:tcPr>
           <w:p>
             <w:pPr>
+              <w:pStyle w:val="Normal"/>
               <w:jc w:val="center"/>
               <w:pBdr>
                 <w:bottom w:val="none" w:sz="0" w:space="0" w:color="000000"/>
@@ -8103,6 +8196,7 @@
           </w:tcPr>
           <w:p>
             <w:pPr>
+              <w:pStyle w:val="Normal"/>
               <w:jc w:val="center"/>
               <w:pBdr>
                 <w:bottom w:val="none" w:sz="0" w:space="0" w:color="000000"/>
@@ -8143,7 +8237,6 @@
         <w:trPr>
           <w:trHeight w:val="360" w:hRule="auto"/>
         </w:trPr>
-        body11
         <w:tc>
           <w:tcPr>
             <w:tcBorders>
@@ -8163,6 +8256,7 @@
           </w:tcPr>
           <w:p>
             <w:pPr>
+              <w:pStyle w:val="Normal"/>
               <w:jc w:val="left"/>
               <w:pBdr>
                 <w:bottom w:val="none" w:sz="0" w:space="0" w:color="000000"/>
@@ -8217,6 +8311,7 @@
           </w:tcPr>
           <w:p>
             <w:pPr>
+              <w:pStyle w:val="Normal"/>
               <w:jc w:val="center"/>
               <w:pBdr>
                 <w:bottom w:val="none" w:sz="0" w:space="0" w:color="000000"/>
@@ -8271,6 +8366,7 @@
           </w:tcPr>
           <w:p>
             <w:pPr>
+              <w:pStyle w:val="Normal"/>
               <w:jc w:val="center"/>
               <w:pBdr>
                 <w:bottom w:val="none" w:sz="0" w:space="0" w:color="000000"/>
@@ -8311,26 +8407,26 @@
         <w:trPr>
           <w:trHeight w:val="360" w:hRule="auto"/>
         </w:trPr>
-        body12
-        <w:tc>
-          <w:tcPr>
-            <w:tcBorders>
-              <w:bottom w:val="none" w:sz="0" w:space="0" w:color="000000"/>
-              <w:top w:val="none" w:sz="0" w:space="0" w:color="000000"/>
-              <w:left w:val="none" w:sz="0" w:space="0" w:color="000000"/>
-              <w:right w:val="none" w:sz="0" w:space="0" w:color="000000"/>
-            </w:tcBorders>
-            <w:shd w:val="clear" w:color="auto" w:fill="FFFFFF"/>
-            <w:tcMar>
-              <w:top w:w="0" w:type="dxa"/>
-              <w:bottom w:w="0" w:type="dxa"/>
-              <w:left w:w="0" w:type="dxa"/>
-              <w:right w:w="0" w:type="dxa"/>
-            </w:tcMar>
-            <w:vAlign w:val="center"/>
-          </w:tcPr>
-          <w:p>
-            <w:pPr>
+        <w:tc>
+          <w:tcPr>
+            <w:tcBorders>
+              <w:bottom w:val="none" w:sz="0" w:space="0" w:color="000000"/>
+              <w:top w:val="none" w:sz="0" w:space="0" w:color="000000"/>
+              <w:left w:val="none" w:sz="0" w:space="0" w:color="000000"/>
+              <w:right w:val="none" w:sz="0" w:space="0" w:color="000000"/>
+            </w:tcBorders>
+            <w:shd w:val="clear" w:color="auto" w:fill="FFFFFF"/>
+            <w:tcMar>
+              <w:top w:w="0" w:type="dxa"/>
+              <w:bottom w:w="0" w:type="dxa"/>
+              <w:left w:w="0" w:type="dxa"/>
+              <w:right w:w="0" w:type="dxa"/>
+            </w:tcMar>
+            <w:vAlign w:val="center"/>
+          </w:tcPr>
+          <w:p>
+            <w:pPr>
+              <w:pStyle w:val="Normal"/>
               <w:jc w:val="left"/>
               <w:pBdr>
                 <w:bottom w:val="none" w:sz="0" w:space="0" w:color="000000"/>
@@ -8385,6 +8481,7 @@
           </w:tcPr>
           <w:p>
             <w:pPr>
+              <w:pStyle w:val="Normal"/>
               <w:jc w:val="center"/>
               <w:pBdr>
                 <w:bottom w:val="none" w:sz="0" w:space="0" w:color="000000"/>
@@ -8439,6 +8536,7 @@
           </w:tcPr>
           <w:p>
             <w:pPr>
+              <w:pStyle w:val="Normal"/>
               <w:jc w:val="center"/>
               <w:pBdr>
                 <w:bottom w:val="none" w:sz="0" w:space="0" w:color="000000"/>
@@ -8479,26 +8577,26 @@
         <w:trPr>
           <w:trHeight w:val="360" w:hRule="auto"/>
         </w:trPr>
-        body13
-        <w:tc>
-          <w:tcPr>
-            <w:tcBorders>
-              <w:bottom w:val="none" w:sz="0" w:space="0" w:color="000000"/>
-              <w:top w:val="none" w:sz="0" w:space="0" w:color="000000"/>
-              <w:left w:val="none" w:sz="0" w:space="0" w:color="000000"/>
-              <w:right w:val="none" w:sz="0" w:space="0" w:color="000000"/>
-            </w:tcBorders>
-            <w:shd w:val="clear" w:color="auto" w:fill="FFFFFF"/>
-            <w:tcMar>
-              <w:top w:w="0" w:type="dxa"/>
-              <w:bottom w:w="0" w:type="dxa"/>
-              <w:left w:w="0" w:type="dxa"/>
-              <w:right w:w="0" w:type="dxa"/>
-            </w:tcMar>
-            <w:vAlign w:val="center"/>
-          </w:tcPr>
-          <w:p>
-            <w:pPr>
+        <w:tc>
+          <w:tcPr>
+            <w:tcBorders>
+              <w:bottom w:val="none" w:sz="0" w:space="0" w:color="000000"/>
+              <w:top w:val="none" w:sz="0" w:space="0" w:color="000000"/>
+              <w:left w:val="none" w:sz="0" w:space="0" w:color="000000"/>
+              <w:right w:val="none" w:sz="0" w:space="0" w:color="000000"/>
+            </w:tcBorders>
+            <w:shd w:val="clear" w:color="auto" w:fill="FFFFFF"/>
+            <w:tcMar>
+              <w:top w:w="0" w:type="dxa"/>
+              <w:bottom w:w="0" w:type="dxa"/>
+              <w:left w:w="0" w:type="dxa"/>
+              <w:right w:w="0" w:type="dxa"/>
+            </w:tcMar>
+            <w:vAlign w:val="center"/>
+          </w:tcPr>
+          <w:p>
+            <w:pPr>
+              <w:pStyle w:val="Normal"/>
               <w:jc w:val="left"/>
               <w:pBdr>
                 <w:bottom w:val="none" w:sz="0" w:space="0" w:color="000000"/>
@@ -8553,6 +8651,7 @@
           </w:tcPr>
           <w:p>
             <w:pPr>
+              <w:pStyle w:val="Normal"/>
               <w:jc w:val="center"/>
               <w:pBdr>
                 <w:bottom w:val="none" w:sz="0" w:space="0" w:color="000000"/>
@@ -8607,6 +8706,7 @@
           </w:tcPr>
           <w:p>
             <w:pPr>
+              <w:pStyle w:val="Normal"/>
               <w:jc w:val="center"/>
               <w:pBdr>
                 <w:bottom w:val="none" w:sz="0" w:space="0" w:color="000000"/>
@@ -8647,26 +8747,26 @@
         <w:trPr>
           <w:trHeight w:val="360" w:hRule="auto"/>
         </w:trPr>
-        body14
-        <w:tc>
-          <w:tcPr>
-            <w:tcBorders>
-              <w:bottom w:val="none" w:sz="0" w:space="0" w:color="000000"/>
-              <w:top w:val="none" w:sz="0" w:space="0" w:color="000000"/>
-              <w:left w:val="none" w:sz="0" w:space="0" w:color="000000"/>
-              <w:right w:val="none" w:sz="0" w:space="0" w:color="000000"/>
-            </w:tcBorders>
-            <w:shd w:val="clear" w:color="auto" w:fill="FFFFFF"/>
-            <w:tcMar>
-              <w:top w:w="0" w:type="dxa"/>
-              <w:bottom w:w="0" w:type="dxa"/>
-              <w:left w:w="0" w:type="dxa"/>
-              <w:right w:w="0" w:type="dxa"/>
-            </w:tcMar>
-            <w:vAlign w:val="center"/>
-          </w:tcPr>
-          <w:p>
-            <w:pPr>
+        <w:tc>
+          <w:tcPr>
+            <w:tcBorders>
+              <w:bottom w:val="none" w:sz="0" w:space="0" w:color="000000"/>
+              <w:top w:val="none" w:sz="0" w:space="0" w:color="000000"/>
+              <w:left w:val="none" w:sz="0" w:space="0" w:color="000000"/>
+              <w:right w:val="none" w:sz="0" w:space="0" w:color="000000"/>
+            </w:tcBorders>
+            <w:shd w:val="clear" w:color="auto" w:fill="FFFFFF"/>
+            <w:tcMar>
+              <w:top w:w="0" w:type="dxa"/>
+              <w:bottom w:w="0" w:type="dxa"/>
+              <w:left w:w="0" w:type="dxa"/>
+              <w:right w:w="0" w:type="dxa"/>
+            </w:tcMar>
+            <w:vAlign w:val="center"/>
+          </w:tcPr>
+          <w:p>
+            <w:pPr>
+              <w:pStyle w:val="Normal"/>
               <w:jc w:val="left"/>
               <w:pBdr>
                 <w:bottom w:val="none" w:sz="0" w:space="0" w:color="000000"/>
@@ -8721,6 +8821,7 @@
           </w:tcPr>
           <w:p>
             <w:pPr>
+              <w:pStyle w:val="Normal"/>
               <w:jc w:val="center"/>
               <w:pBdr>
                 <w:bottom w:val="none" w:sz="0" w:space="0" w:color="000000"/>
@@ -8775,6 +8876,7 @@
           </w:tcPr>
           <w:p>
             <w:pPr>
+              <w:pStyle w:val="Normal"/>
               <w:jc w:val="center"/>
               <w:pBdr>
                 <w:bottom w:val="none" w:sz="0" w:space="0" w:color="000000"/>
@@ -8815,26 +8917,26 @@
         <w:trPr>
           <w:trHeight w:val="360" w:hRule="auto"/>
         </w:trPr>
-        body15
-        <w:tc>
-          <w:tcPr>
-            <w:tcBorders>
-              <w:bottom w:val="none" w:sz="0" w:space="0" w:color="000000"/>
-              <w:top w:val="none" w:sz="0" w:space="0" w:color="000000"/>
-              <w:left w:val="none" w:sz="0" w:space="0" w:color="000000"/>
-              <w:right w:val="none" w:sz="0" w:space="0" w:color="000000"/>
-            </w:tcBorders>
-            <w:shd w:val="clear" w:color="auto" w:fill="FFFFFF"/>
-            <w:tcMar>
-              <w:top w:w="0" w:type="dxa"/>
-              <w:bottom w:w="0" w:type="dxa"/>
-              <w:left w:w="0" w:type="dxa"/>
-              <w:right w:w="0" w:type="dxa"/>
-            </w:tcMar>
-            <w:vAlign w:val="center"/>
-          </w:tcPr>
-          <w:p>
-            <w:pPr>
+        <w:tc>
+          <w:tcPr>
+            <w:tcBorders>
+              <w:bottom w:val="none" w:sz="0" w:space="0" w:color="000000"/>
+              <w:top w:val="none" w:sz="0" w:space="0" w:color="000000"/>
+              <w:left w:val="none" w:sz="0" w:space="0" w:color="000000"/>
+              <w:right w:val="none" w:sz="0" w:space="0" w:color="000000"/>
+            </w:tcBorders>
+            <w:shd w:val="clear" w:color="auto" w:fill="FFFFFF"/>
+            <w:tcMar>
+              <w:top w:w="0" w:type="dxa"/>
+              <w:bottom w:w="0" w:type="dxa"/>
+              <w:left w:w="0" w:type="dxa"/>
+              <w:right w:w="0" w:type="dxa"/>
+            </w:tcMar>
+            <w:vAlign w:val="center"/>
+          </w:tcPr>
+          <w:p>
+            <w:pPr>
+              <w:pStyle w:val="Normal"/>
               <w:jc w:val="left"/>
               <w:pBdr>
                 <w:bottom w:val="none" w:sz="0" w:space="0" w:color="000000"/>
@@ -8889,6 +8991,7 @@
           </w:tcPr>
           <w:p>
             <w:pPr>
+              <w:pStyle w:val="Normal"/>
               <w:jc w:val="center"/>
               <w:pBdr>
                 <w:bottom w:val="none" w:sz="0" w:space="0" w:color="000000"/>
@@ -8943,6 +9046,7 @@
           </w:tcPr>
           <w:p>
             <w:pPr>
+              <w:pStyle w:val="Normal"/>
               <w:jc w:val="center"/>
               <w:pBdr>
                 <w:bottom w:val="none" w:sz="0" w:space="0" w:color="000000"/>
@@ -8983,26 +9087,26 @@
         <w:trPr>
           <w:trHeight w:val="360" w:hRule="auto"/>
         </w:trPr>
-        body16
-        <w:tc>
-          <w:tcPr>
-            <w:tcBorders>
-              <w:bottom w:val="none" w:sz="0" w:space="0" w:color="000000"/>
-              <w:top w:val="none" w:sz="0" w:space="0" w:color="000000"/>
-              <w:left w:val="none" w:sz="0" w:space="0" w:color="000000"/>
-              <w:right w:val="none" w:sz="0" w:space="0" w:color="000000"/>
-            </w:tcBorders>
-            <w:shd w:val="clear" w:color="auto" w:fill="FFFFFF"/>
-            <w:tcMar>
-              <w:top w:w="0" w:type="dxa"/>
-              <w:bottom w:w="0" w:type="dxa"/>
-              <w:left w:w="0" w:type="dxa"/>
-              <w:right w:w="0" w:type="dxa"/>
-            </w:tcMar>
-            <w:vAlign w:val="center"/>
-          </w:tcPr>
-          <w:p>
-            <w:pPr>
+        <w:tc>
+          <w:tcPr>
+            <w:tcBorders>
+              <w:bottom w:val="none" w:sz="0" w:space="0" w:color="000000"/>
+              <w:top w:val="none" w:sz="0" w:space="0" w:color="000000"/>
+              <w:left w:val="none" w:sz="0" w:space="0" w:color="000000"/>
+              <w:right w:val="none" w:sz="0" w:space="0" w:color="000000"/>
+            </w:tcBorders>
+            <w:shd w:val="clear" w:color="auto" w:fill="FFFFFF"/>
+            <w:tcMar>
+              <w:top w:w="0" w:type="dxa"/>
+              <w:bottom w:w="0" w:type="dxa"/>
+              <w:left w:w="0" w:type="dxa"/>
+              <w:right w:w="0" w:type="dxa"/>
+            </w:tcMar>
+            <w:vAlign w:val="center"/>
+          </w:tcPr>
+          <w:p>
+            <w:pPr>
+              <w:pStyle w:val="Normal"/>
               <w:jc w:val="left"/>
               <w:pBdr>
                 <w:bottom w:val="none" w:sz="0" w:space="0" w:color="000000"/>
@@ -9057,6 +9161,7 @@
           </w:tcPr>
           <w:p>
             <w:pPr>
+              <w:pStyle w:val="Normal"/>
               <w:jc w:val="center"/>
               <w:pBdr>
                 <w:bottom w:val="none" w:sz="0" w:space="0" w:color="000000"/>
@@ -9111,6 +9216,7 @@
           </w:tcPr>
           <w:p>
             <w:pPr>
+              <w:pStyle w:val="Normal"/>
               <w:jc w:val="center"/>
               <w:pBdr>
                 <w:bottom w:val="none" w:sz="0" w:space="0" w:color="000000"/>
@@ -9151,7 +9257,6 @@
         <w:trPr>
           <w:trHeight w:val="360" w:hRule="auto"/>
         </w:trPr>
-        body17
         <w:tc>
           <w:tcPr>
             <w:tcBorders>
@@ -9171,6 +9276,7 @@
           </w:tcPr>
           <w:p>
             <w:pPr>
+              <w:pStyle w:val="Normal"/>
               <w:jc w:val="left"/>
               <w:pBdr>
                 <w:bottom w:val="none" w:sz="0" w:space="0" w:color="000000"/>
@@ -9225,6 +9331,7 @@
           </w:tcPr>
           <w:p>
             <w:pPr>
+              <w:pStyle w:val="Normal"/>
               <w:jc w:val="center"/>
               <w:pBdr>
                 <w:bottom w:val="none" w:sz="0" w:space="0" w:color="000000"/>
@@ -9279,6 +9386,7 @@
           </w:tcPr>
           <w:p>
             <w:pPr>
+              <w:pStyle w:val="Normal"/>
               <w:jc w:val="center"/>
               <w:pBdr>
                 <w:bottom w:val="none" w:sz="0" w:space="0" w:color="000000"/>
@@ -9319,7 +9427,6 @@
         <w:trPr>
           <w:trHeight w:val="360" w:hRule="auto"/>
         </w:trPr>
-        footer 1
         <w:tc>
           <w:tcPr>
             <w:gridSpan w:val="3"/>
@@ -9340,6 +9447,7 @@
           </w:tcPr>
           <w:p>
             <w:pPr>
+              <w:pStyle w:val="Normal"/>
               <w:jc w:val="left"/>
               <w:pBdr>
                 <w:bottom w:val="none" w:sz="0" w:space="0" w:color="000000"/>

</xml_diff>